<commit_message>
Add a class library and pizza DAO and pizza logic classes.
</commit_message>
<xml_diff>
--- a/Activity4/CST-250_Activity4_ChadGalloway.docx
+++ b/Activity4/CST-250_Activity4_ChadGalloway.docx
@@ -538,13 +538,19 @@
         <w:t xml:space="preserve">Figure </w:t>
       </w:r>
       <w:r>
-        <w:t>1</w:t>
+        <w:t>1-</w:t>
+      </w:r>
+      <w:r>
+        <w:t>3</w:t>
       </w:r>
       <w:r>
         <w:t>: App Running</w:t>
       </w:r>
       <w:r>
         <w:t xml:space="preserve"> for the first time</w:t>
+      </w:r>
+      <w:r>
+        <w:t xml:space="preserve"> after completing part one</w:t>
       </w:r>
       <w:r>
         <w:t>.</w:t>
@@ -552,6 +558,61 @@
     </w:p>
     <w:p/>
     <w:p/>
+    <w:p/>
+    <w:p/>
+    <w:p>
+      <w:pPr>
+        <w:jc w:val="center"/>
+        <w:rPr>
+          <w:b/>
+          <w:sz w:val="28"/>
+          <w:szCs w:val="28"/>
+        </w:rPr>
+      </w:pPr>
+      <w:r>
+        <w:rPr>
+          <w:b/>
+          <w:sz w:val="28"/>
+          <w:szCs w:val="28"/>
+        </w:rPr>
+        <w:lastRenderedPageBreak/>
+        <w:t xml:space="preserve">Part </w:t>
+      </w:r>
+      <w:r>
+        <w:rPr>
+          <w:b/>
+          <w:sz w:val="28"/>
+          <w:szCs w:val="28"/>
+        </w:rPr>
+        <w:t>2</w:t>
+      </w:r>
+    </w:p>
+    <w:p>
+      <w:pPr>
+        <w:jc w:val="center"/>
+        <w:rPr>
+          <w:b/>
+          <w:sz w:val="28"/>
+          <w:szCs w:val="28"/>
+        </w:rPr>
+      </w:pPr>
+    </w:p>
+    <w:p>
+      <w:pPr>
+        <w:jc w:val="center"/>
+        <w:rPr>
+          <w:sz w:val="28"/>
+          <w:szCs w:val="28"/>
+        </w:rPr>
+      </w:pPr>
+      <w:r>
+        <w:rPr>
+          <w:sz w:val="28"/>
+          <w:szCs w:val="28"/>
+        </w:rPr>
+        <w:t>Screen Shots</w:t>
+      </w:r>
+    </w:p>
     <w:p>
       <w:pPr>
         <w:jc w:val="center"/>
@@ -569,23 +630,29 @@
         <w:rPr>
           <w:noProof/>
         </w:rPr>
-        <w:lastRenderedPageBreak/>
         <w:drawing>
-          <wp:inline distT="114300" distB="114300" distL="114300" distR="114300" wp14:anchorId="6D4325D3" wp14:editId="440EF182">
-            <wp:extent cx="3148013" cy="1796373"/>
-            <wp:effectExtent l="0" t="0" r="0" b="0"/>
+          <wp:inline distT="114300" distB="114300" distL="114300" distR="114300" wp14:anchorId="6D4325D3" wp14:editId="7282C0C3">
+            <wp:extent cx="5943600" cy="6601968"/>
+            <wp:effectExtent l="0" t="0" r="0" b="8890"/>
             <wp:docPr id="547260474" name="image1.jpg"/>
-            <wp:cNvGraphicFramePr/>
+            <wp:cNvGraphicFramePr>
+              <a:graphicFrameLocks xmlns:a="http://schemas.openxmlformats.org/drawingml/2006/main" noChangeAspect="1"/>
+            </wp:cNvGraphicFramePr>
             <a:graphic xmlns:a="http://schemas.openxmlformats.org/drawingml/2006/main">
               <a:graphicData uri="http://schemas.openxmlformats.org/drawingml/2006/picture">
                 <pic:pic xmlns:pic="http://schemas.openxmlformats.org/drawingml/2006/picture">
                   <pic:nvPicPr>
-                    <pic:cNvPr id="0" name="image1.jpg"/>
-                    <pic:cNvPicPr preferRelativeResize="0"/>
+                    <pic:cNvPr id="547260474" name="image1.jpg"/>
+                    <pic:cNvPicPr/>
                   </pic:nvPicPr>
                   <pic:blipFill>
-                    <a:blip r:embed="rId6"/>
-                    <a:srcRect/>
+                    <a:blip r:embed="rId8">
+                      <a:extLst>
+                        <a:ext uri="{28A0092B-C50C-407E-A947-70E740481C1C}">
+                          <a14:useLocalDpi xmlns:a14="http://schemas.microsoft.com/office/drawing/2010/main" val="0"/>
+                        </a:ext>
+                      </a:extLst>
+                    </a:blip>
                     <a:stretch>
                       <a:fillRect/>
                     </a:stretch>
@@ -593,7 +660,7 @@
                   <pic:spPr>
                     <a:xfrm>
                       <a:off x="0" y="0"/>
-                      <a:ext cx="3148013" cy="1796373"/>
+                      <a:ext cx="5943600" cy="6601968"/>
                     </a:xfrm>
                     <a:prstGeom prst="rect">
                       <a:avLst/>
@@ -612,20 +679,25 @@
         <w:jc w:val="center"/>
       </w:pPr>
       <w:r>
-        <w:t>Figure X: Screenshot of successful output</w:t>
-      </w:r>
-    </w:p>
-    <w:p>
-      <w:pPr>
-        <w:jc w:val="center"/>
-      </w:pPr>
-    </w:p>
-    <w:p>
-      <w:r>
-        <w:rPr>
-          <w:lang w:val="en-US"/>
-        </w:rPr>
-        <w:t>Lorem ipsum dolor sit amet, consectetur adipiscing elit, sed do eiusmod tempor incididunt ut labore et dolore magna aliqua. Ut enim ad minim veniam, quis nostrud exercitation ullamco laboris nisi ut aliquip ex ea commodo consequat. Duis aute irure dolor in reprehenderit in voluptate velit esse cillum dolore eu fugiat nulla pariatur. Excepteur sint occaecat cupidatat non proident, sunt in culpa qui officia deserunt mollit anim id est laborum.</w:t>
+        <w:t xml:space="preserve">Figure </w:t>
+      </w:r>
+      <w:r>
+        <w:t>2-1</w:t>
+      </w:r>
+      <w:r>
+        <w:t>: Screenshot of successful output</w:t>
+      </w:r>
+      <w:r>
+        <w:t xml:space="preserve"> after the addition of event handlers for the</w:t>
+      </w:r>
+      <w:r>
+        <w:t xml:space="preserve"> </w:t>
+      </w:r>
+      <w:r>
+        <w:t>UI</w:t>
+      </w:r>
+      <w:r>
+        <w:t>.</w:t>
       </w:r>
     </w:p>
     <w:p/>
@@ -638,22 +710,30 @@
         <w:rPr>
           <w:noProof/>
         </w:rPr>
+        <w:lastRenderedPageBreak/>
         <w:drawing>
-          <wp:inline distT="114300" distB="114300" distL="114300" distR="114300" wp14:anchorId="0C53EAC3" wp14:editId="0A61E8D9">
-            <wp:extent cx="3148013" cy="1796373"/>
+          <wp:inline distT="114300" distB="114300" distL="114300" distR="114300" wp14:anchorId="0C53EAC3" wp14:editId="407495A8">
+            <wp:extent cx="5943600" cy="2286000"/>
             <wp:effectExtent l="0" t="0" r="0" b="0"/>
             <wp:docPr id="984152048" name="image1.jpg"/>
-            <wp:cNvGraphicFramePr/>
+            <wp:cNvGraphicFramePr>
+              <a:graphicFrameLocks xmlns:a="http://schemas.openxmlformats.org/drawingml/2006/main" noChangeAspect="1"/>
+            </wp:cNvGraphicFramePr>
             <a:graphic xmlns:a="http://schemas.openxmlformats.org/drawingml/2006/main">
               <a:graphicData uri="http://schemas.openxmlformats.org/drawingml/2006/picture">
                 <pic:pic xmlns:pic="http://schemas.openxmlformats.org/drawingml/2006/picture">
                   <pic:nvPicPr>
-                    <pic:cNvPr id="0" name="image1.jpg"/>
-                    <pic:cNvPicPr preferRelativeResize="0"/>
+                    <pic:cNvPr id="984152048" name="image1.jpg"/>
+                    <pic:cNvPicPr/>
                   </pic:nvPicPr>
                   <pic:blipFill>
-                    <a:blip r:embed="rId6"/>
-                    <a:srcRect/>
+                    <a:blip r:embed="rId9" cstate="print">
+                      <a:extLst>
+                        <a:ext uri="{28A0092B-C50C-407E-A947-70E740481C1C}">
+                          <a14:useLocalDpi xmlns:a14="http://schemas.microsoft.com/office/drawing/2010/main" val="0"/>
+                        </a:ext>
+                      </a:extLst>
+                    </a:blip>
                     <a:stretch>
                       <a:fillRect/>
                     </a:stretch>
@@ -661,7 +741,7 @@
                   <pic:spPr>
                     <a:xfrm>
                       <a:off x="0" y="0"/>
-                      <a:ext cx="3148013" cy="1796373"/>
+                      <a:ext cx="5943600" cy="2286000"/>
                     </a:xfrm>
                     <a:prstGeom prst="rect">
                       <a:avLst/>
@@ -680,26 +760,527 @@
         <w:jc w:val="center"/>
       </w:pPr>
       <w:r>
-        <w:t>Figure X: Screenshot of Error Handling</w:t>
-      </w:r>
-    </w:p>
-    <w:p>
-      <w:pPr>
-        <w:jc w:val="center"/>
-      </w:pPr>
-    </w:p>
-    <w:p>
-      <w:r>
-        <w:rPr>
-          <w:lang w:val="en-US"/>
-        </w:rPr>
-        <w:t>Lorem ipsum dolor sit amet, consectetur adipiscing elit, sed do eiusmod tempor incididunt ut labore et dolore magna aliqua. Ut enim ad minim veniam, quis nostrud exercitation ullamco laboris nisi ut aliquip ex ea commodo consequat. Duis aute irure dolor in reprehenderit in voluptate velit esse cillum dolore eu fugiat nulla pariatur. Excepteur sint occaecat cupidatat non proident, sunt in culpa qui officia deserunt mollit anim id est laborum.</w:t>
+        <w:t xml:space="preserve">Figure </w:t>
+      </w:r>
+      <w:r>
+        <w:t>2-2</w:t>
+      </w:r>
+      <w:r>
+        <w:t xml:space="preserve">: Screenshot of </w:t>
+      </w:r>
+      <w:r>
+        <w:t>FrmPizzaMaker</w:t>
+      </w:r>
+      <w:r>
+        <w:t xml:space="preserve"> citations and constructor</w:t>
+      </w:r>
+    </w:p>
+    <w:p>
+      <w:pPr>
+        <w:jc w:val="center"/>
+      </w:pPr>
+    </w:p>
+    <w:p>
+      <w:pPr>
+        <w:jc w:val="center"/>
+      </w:pPr>
+      <w:r>
+        <w:rPr>
+          <w:noProof/>
+        </w:rPr>
+        <w:drawing>
+          <wp:inline distT="114300" distB="114300" distL="114300" distR="114300" wp14:anchorId="2AF173B1" wp14:editId="00BBD204">
+            <wp:extent cx="5943600" cy="2935224"/>
+            <wp:effectExtent l="0" t="0" r="0" b="0"/>
+            <wp:docPr id="844609594" name="image1.jpg"/>
+            <wp:cNvGraphicFramePr>
+              <a:graphicFrameLocks xmlns:a="http://schemas.openxmlformats.org/drawingml/2006/main" noChangeAspect="1"/>
+            </wp:cNvGraphicFramePr>
+            <a:graphic xmlns:a="http://schemas.openxmlformats.org/drawingml/2006/main">
+              <a:graphicData uri="http://schemas.openxmlformats.org/drawingml/2006/picture">
+                <pic:pic xmlns:pic="http://schemas.openxmlformats.org/drawingml/2006/picture">
+                  <pic:nvPicPr>
+                    <pic:cNvPr id="844609594" name="image1.jpg"/>
+                    <pic:cNvPicPr/>
+                  </pic:nvPicPr>
+                  <pic:blipFill>
+                    <a:blip r:embed="rId10" cstate="print">
+                      <a:extLst>
+                        <a:ext uri="{28A0092B-C50C-407E-A947-70E740481C1C}">
+                          <a14:useLocalDpi xmlns:a14="http://schemas.microsoft.com/office/drawing/2010/main" val="0"/>
+                        </a:ext>
+                      </a:extLst>
+                    </a:blip>
+                    <a:stretch>
+                      <a:fillRect/>
+                    </a:stretch>
+                  </pic:blipFill>
+                  <pic:spPr>
+                    <a:xfrm>
+                      <a:off x="0" y="0"/>
+                      <a:ext cx="5943600" cy="2935224"/>
+                    </a:xfrm>
+                    <a:prstGeom prst="rect">
+                      <a:avLst/>
+                    </a:prstGeom>
+                    <a:ln/>
+                  </pic:spPr>
+                </pic:pic>
+              </a:graphicData>
+            </a:graphic>
+          </wp:inline>
+        </w:drawing>
+      </w:r>
+    </w:p>
+    <w:p>
+      <w:pPr>
+        <w:jc w:val="center"/>
+      </w:pPr>
+      <w:r>
+        <w:t xml:space="preserve">Figure </w:t>
+      </w:r>
+      <w:r>
+        <w:t>2-3</w:t>
+      </w:r>
+      <w:r>
+        <w:t>: Screenshot of PizzaModel citations and constructor</w:t>
       </w:r>
     </w:p>
     <w:p/>
     <w:p>
-      <w:r>
-        <w:br w:type="page"/>
+      <w:pPr>
+        <w:jc w:val="center"/>
+      </w:pPr>
+      <w:r>
+        <w:rPr>
+          <w:noProof/>
+        </w:rPr>
+        <w:lastRenderedPageBreak/>
+        <w:drawing>
+          <wp:inline distT="114300" distB="114300" distL="114300" distR="114300" wp14:anchorId="13231E9B" wp14:editId="7EF9FB24">
+            <wp:extent cx="5943600" cy="2898648"/>
+            <wp:effectExtent l="0" t="0" r="0" b="0"/>
+            <wp:docPr id="1802167946" name="image1.jpg"/>
+            <wp:cNvGraphicFramePr>
+              <a:graphicFrameLocks xmlns:a="http://schemas.openxmlformats.org/drawingml/2006/main" noChangeAspect="1"/>
+            </wp:cNvGraphicFramePr>
+            <a:graphic xmlns:a="http://schemas.openxmlformats.org/drawingml/2006/main">
+              <a:graphicData uri="http://schemas.openxmlformats.org/drawingml/2006/picture">
+                <pic:pic xmlns:pic="http://schemas.openxmlformats.org/drawingml/2006/picture">
+                  <pic:nvPicPr>
+                    <pic:cNvPr id="1802167946" name="image1.jpg"/>
+                    <pic:cNvPicPr/>
+                  </pic:nvPicPr>
+                  <pic:blipFill>
+                    <a:blip r:embed="rId11" cstate="print">
+                      <a:extLst>
+                        <a:ext uri="{28A0092B-C50C-407E-A947-70E740481C1C}">
+                          <a14:useLocalDpi xmlns:a14="http://schemas.microsoft.com/office/drawing/2010/main" val="0"/>
+                        </a:ext>
+                      </a:extLst>
+                    </a:blip>
+                    <a:stretch>
+                      <a:fillRect/>
+                    </a:stretch>
+                  </pic:blipFill>
+                  <pic:spPr>
+                    <a:xfrm>
+                      <a:off x="0" y="0"/>
+                      <a:ext cx="5943600" cy="2898648"/>
+                    </a:xfrm>
+                    <a:prstGeom prst="rect">
+                      <a:avLst/>
+                    </a:prstGeom>
+                    <a:ln/>
+                  </pic:spPr>
+                </pic:pic>
+              </a:graphicData>
+            </a:graphic>
+          </wp:inline>
+        </w:drawing>
+      </w:r>
+    </w:p>
+    <w:p>
+      <w:pPr>
+        <w:jc w:val="center"/>
+      </w:pPr>
+      <w:r>
+        <w:t xml:space="preserve">Figure </w:t>
+      </w:r>
+      <w:r>
+        <w:t>2-4</w:t>
+      </w:r>
+      <w:r>
+        <w:t xml:space="preserve">: Screenshot of </w:t>
+      </w:r>
+      <w:r>
+        <w:t>Enable pizza creation,</w:t>
+      </w:r>
+      <w:r>
+        <w:t xml:space="preserve"> txt name leave, and chb ingredient</w:t>
+      </w:r>
+      <w:r>
+        <w:t>s checked changed eh</w:t>
+      </w:r>
+      <w:r>
+        <w:t xml:space="preserve"> methods.</w:t>
+      </w:r>
+    </w:p>
+    <w:p>
+      <w:pPr>
+        <w:jc w:val="center"/>
+      </w:pPr>
+    </w:p>
+    <w:p>
+      <w:pPr>
+        <w:jc w:val="center"/>
+      </w:pPr>
+      <w:r>
+        <w:rPr>
+          <w:noProof/>
+        </w:rPr>
+        <w:drawing>
+          <wp:inline distT="114300" distB="114300" distL="114300" distR="114300" wp14:anchorId="32594D95" wp14:editId="54926600">
+            <wp:extent cx="5941673" cy="2898648"/>
+            <wp:effectExtent l="0" t="0" r="2540" b="0"/>
+            <wp:docPr id="1783945670" name="image1.jpg"/>
+            <wp:cNvGraphicFramePr>
+              <a:graphicFrameLocks xmlns:a="http://schemas.openxmlformats.org/drawingml/2006/main" noChangeAspect="1"/>
+            </wp:cNvGraphicFramePr>
+            <a:graphic xmlns:a="http://schemas.openxmlformats.org/drawingml/2006/main">
+              <a:graphicData uri="http://schemas.openxmlformats.org/drawingml/2006/picture">
+                <pic:pic xmlns:pic="http://schemas.openxmlformats.org/drawingml/2006/picture">
+                  <pic:nvPicPr>
+                    <pic:cNvPr id="1783945670" name="image1.jpg"/>
+                    <pic:cNvPicPr/>
+                  </pic:nvPicPr>
+                  <pic:blipFill>
+                    <a:blip r:embed="rId12" cstate="print">
+                      <a:extLst>
+                        <a:ext uri="{28A0092B-C50C-407E-A947-70E740481C1C}">
+                          <a14:useLocalDpi xmlns:a14="http://schemas.microsoft.com/office/drawing/2010/main" val="0"/>
+                        </a:ext>
+                      </a:extLst>
+                    </a:blip>
+                    <a:stretch>
+                      <a:fillRect/>
+                    </a:stretch>
+                  </pic:blipFill>
+                  <pic:spPr>
+                    <a:xfrm>
+                      <a:off x="0" y="0"/>
+                      <a:ext cx="5941673" cy="2898648"/>
+                    </a:xfrm>
+                    <a:prstGeom prst="rect">
+                      <a:avLst/>
+                    </a:prstGeom>
+                    <a:ln/>
+                  </pic:spPr>
+                </pic:pic>
+              </a:graphicData>
+            </a:graphic>
+          </wp:inline>
+        </w:drawing>
+      </w:r>
+    </w:p>
+    <w:p>
+      <w:pPr>
+        <w:jc w:val="center"/>
+      </w:pPr>
+      <w:r>
+        <w:t xml:space="preserve">Figure </w:t>
+      </w:r>
+      <w:r>
+        <w:t>2-5</w:t>
+      </w:r>
+      <w:r>
+        <w:t xml:space="preserve">: Screenshot of </w:t>
+      </w:r>
+      <w:r>
+        <w:t>Lsb strange add ons selected index changed eh</w:t>
+      </w:r>
+      <w:r>
+        <w:t xml:space="preserve">, update price, and </w:t>
+      </w:r>
+      <w:r>
+        <w:t>rdo crust checked changed eh methods</w:t>
+      </w:r>
+      <w:r>
+        <w:t>.</w:t>
+      </w:r>
+    </w:p>
+    <w:p>
+      <w:pPr>
+        <w:jc w:val="center"/>
+      </w:pPr>
+    </w:p>
+    <w:p>
+      <w:pPr>
+        <w:jc w:val="center"/>
+      </w:pPr>
+    </w:p>
+    <w:p>
+      <w:pPr>
+        <w:jc w:val="center"/>
+      </w:pPr>
+      <w:r>
+        <w:rPr>
+          <w:noProof/>
+        </w:rPr>
+        <w:lastRenderedPageBreak/>
+        <w:drawing>
+          <wp:inline distT="114300" distB="114300" distL="114300" distR="114300" wp14:anchorId="5478EF2C" wp14:editId="4B4199EC">
+            <wp:extent cx="5943600" cy="3154680"/>
+            <wp:effectExtent l="0" t="0" r="0" b="7620"/>
+            <wp:docPr id="1984045560" name="image1.jpg"/>
+            <wp:cNvGraphicFramePr>
+              <a:graphicFrameLocks xmlns:a="http://schemas.openxmlformats.org/drawingml/2006/main" noChangeAspect="1"/>
+            </wp:cNvGraphicFramePr>
+            <a:graphic xmlns:a="http://schemas.openxmlformats.org/drawingml/2006/main">
+              <a:graphicData uri="http://schemas.openxmlformats.org/drawingml/2006/picture">
+                <pic:pic xmlns:pic="http://schemas.openxmlformats.org/drawingml/2006/picture">
+                  <pic:nvPicPr>
+                    <pic:cNvPr id="1984045560" name="image1.jpg"/>
+                    <pic:cNvPicPr/>
+                  </pic:nvPicPr>
+                  <pic:blipFill>
+                    <a:blip r:embed="rId13" cstate="print">
+                      <a:extLst>
+                        <a:ext uri="{28A0092B-C50C-407E-A947-70E740481C1C}">
+                          <a14:useLocalDpi xmlns:a14="http://schemas.microsoft.com/office/drawing/2010/main" val="0"/>
+                        </a:ext>
+                      </a:extLst>
+                    </a:blip>
+                    <a:stretch>
+                      <a:fillRect/>
+                    </a:stretch>
+                  </pic:blipFill>
+                  <pic:spPr>
+                    <a:xfrm>
+                      <a:off x="0" y="0"/>
+                      <a:ext cx="5943600" cy="3154680"/>
+                    </a:xfrm>
+                    <a:prstGeom prst="rect">
+                      <a:avLst/>
+                    </a:prstGeom>
+                    <a:ln/>
+                  </pic:spPr>
+                </pic:pic>
+              </a:graphicData>
+            </a:graphic>
+          </wp:inline>
+        </w:drawing>
+      </w:r>
+    </w:p>
+    <w:p>
+      <w:pPr>
+        <w:jc w:val="center"/>
+      </w:pPr>
+      <w:r>
+        <w:t xml:space="preserve">Figure </w:t>
+      </w:r>
+      <w:r>
+        <w:t>2-6</w:t>
+      </w:r>
+      <w:r>
+        <w:t xml:space="preserve">: Screenshot of </w:t>
+      </w:r>
+      <w:r>
+        <w:t>Hsb extra goodies value change eh</w:t>
+      </w:r>
+      <w:r>
+        <w:t>, dtp deli</w:t>
+      </w:r>
+      <w:r>
+        <w:t>v</w:t>
+      </w:r>
+      <w:r>
+        <w:t>ery time value changed eh, and</w:t>
+      </w:r>
+      <w:r>
+        <w:t xml:space="preserve"> pic pizza box color click eh</w:t>
+      </w:r>
+      <w:r>
+        <w:t xml:space="preserve"> methods.</w:t>
+      </w:r>
+    </w:p>
+    <w:p>
+      <w:pPr>
+        <w:jc w:val="center"/>
+      </w:pPr>
+    </w:p>
+    <w:p>
+      <w:pPr>
+        <w:jc w:val="center"/>
+      </w:pPr>
+      <w:r>
+        <w:rPr>
+          <w:noProof/>
+        </w:rPr>
+        <w:drawing>
+          <wp:inline distT="114300" distB="114300" distL="114300" distR="114300" wp14:anchorId="004A4F47" wp14:editId="2158EFE3">
+            <wp:extent cx="5943600" cy="3858768"/>
+            <wp:effectExtent l="0" t="0" r="0" b="8890"/>
+            <wp:docPr id="1545086797" name="image1.jpg"/>
+            <wp:cNvGraphicFramePr>
+              <a:graphicFrameLocks xmlns:a="http://schemas.openxmlformats.org/drawingml/2006/main" noChangeAspect="1"/>
+            </wp:cNvGraphicFramePr>
+            <a:graphic xmlns:a="http://schemas.openxmlformats.org/drawingml/2006/main">
+              <a:graphicData uri="http://schemas.openxmlformats.org/drawingml/2006/picture">
+                <pic:pic xmlns:pic="http://schemas.openxmlformats.org/drawingml/2006/picture">
+                  <pic:nvPicPr>
+                    <pic:cNvPr id="1545086797" name="image1.jpg"/>
+                    <pic:cNvPicPr/>
+                  </pic:nvPicPr>
+                  <pic:blipFill>
+                    <a:blip r:embed="rId14" cstate="print">
+                      <a:extLst>
+                        <a:ext uri="{28A0092B-C50C-407E-A947-70E740481C1C}">
+                          <a14:useLocalDpi xmlns:a14="http://schemas.microsoft.com/office/drawing/2010/main" val="0"/>
+                        </a:ext>
+                      </a:extLst>
+                    </a:blip>
+                    <a:stretch>
+                      <a:fillRect/>
+                    </a:stretch>
+                  </pic:blipFill>
+                  <pic:spPr>
+                    <a:xfrm>
+                      <a:off x="0" y="0"/>
+                      <a:ext cx="5943600" cy="3858768"/>
+                    </a:xfrm>
+                    <a:prstGeom prst="rect">
+                      <a:avLst/>
+                    </a:prstGeom>
+                    <a:ln/>
+                  </pic:spPr>
+                </pic:pic>
+              </a:graphicData>
+            </a:graphic>
+          </wp:inline>
+        </w:drawing>
+      </w:r>
+    </w:p>
+    <w:p>
+      <w:pPr>
+        <w:jc w:val="center"/>
+      </w:pPr>
+      <w:r>
+        <w:t xml:space="preserve">Figure </w:t>
+      </w:r>
+      <w:r>
+        <w:t>2-7</w:t>
+      </w:r>
+      <w:r>
+        <w:t xml:space="preserve">: Screenshot of </w:t>
+      </w:r>
+      <w:r>
+        <w:t>reset form and reset controls</w:t>
+      </w:r>
+      <w:r>
+        <w:t xml:space="preserve"> methods.</w:t>
+      </w:r>
+      <w:r>
+        <w:t xml:space="preserve"> (Note: some of the cases are collapse</w:t>
+      </w:r>
+      <w:r>
+        <w:t>d</w:t>
+      </w:r>
+      <w:r>
+        <w:t xml:space="preserve"> in the </w:t>
+      </w:r>
+      <w:r>
+        <w:t>IDE</w:t>
+      </w:r>
+      <w:r>
+        <w:t xml:space="preserve"> to allow it all t</w:t>
+      </w:r>
+      <w:r>
+        <w:t>o</w:t>
+      </w:r>
+      <w:r>
+        <w:t xml:space="preserve"> fit in one screenshot</w:t>
+      </w:r>
+      <w:r>
+        <w:t>)</w:t>
+      </w:r>
+    </w:p>
+    <w:p>
+      <w:pPr>
+        <w:jc w:val="center"/>
+      </w:pPr>
+    </w:p>
+    <w:p>
+      <w:pPr>
+        <w:jc w:val="center"/>
+      </w:pPr>
+      <w:r>
+        <w:rPr>
+          <w:noProof/>
+        </w:rPr>
+        <w:lastRenderedPageBreak/>
+        <w:drawing>
+          <wp:inline distT="114300" distB="114300" distL="114300" distR="114300" wp14:anchorId="301BC1A7" wp14:editId="3BE18FFE">
+            <wp:extent cx="5939449" cy="3785616"/>
+            <wp:effectExtent l="0" t="0" r="4445" b="5715"/>
+            <wp:docPr id="4328791" name="image1.jpg"/>
+            <wp:cNvGraphicFramePr>
+              <a:graphicFrameLocks xmlns:a="http://schemas.openxmlformats.org/drawingml/2006/main" noChangeAspect="1"/>
+            </wp:cNvGraphicFramePr>
+            <a:graphic xmlns:a="http://schemas.openxmlformats.org/drawingml/2006/main">
+              <a:graphicData uri="http://schemas.openxmlformats.org/drawingml/2006/picture">
+                <pic:pic xmlns:pic="http://schemas.openxmlformats.org/drawingml/2006/picture">
+                  <pic:nvPicPr>
+                    <pic:cNvPr id="4328791" name="image1.jpg"/>
+                    <pic:cNvPicPr/>
+                  </pic:nvPicPr>
+                  <pic:blipFill>
+                    <a:blip r:embed="rId15" cstate="print">
+                      <a:extLst>
+                        <a:ext uri="{28A0092B-C50C-407E-A947-70E740481C1C}">
+                          <a14:useLocalDpi xmlns:a14="http://schemas.microsoft.com/office/drawing/2010/main" val="0"/>
+                        </a:ext>
+                      </a:extLst>
+                    </a:blip>
+                    <a:stretch>
+                      <a:fillRect/>
+                    </a:stretch>
+                  </pic:blipFill>
+                  <pic:spPr>
+                    <a:xfrm>
+                      <a:off x="0" y="0"/>
+                      <a:ext cx="5939449" cy="3785616"/>
+                    </a:xfrm>
+                    <a:prstGeom prst="rect">
+                      <a:avLst/>
+                    </a:prstGeom>
+                    <a:ln/>
+                  </pic:spPr>
+                </pic:pic>
+              </a:graphicData>
+            </a:graphic>
+          </wp:inline>
+        </w:drawing>
+      </w:r>
+    </w:p>
+    <w:p>
+      <w:pPr>
+        <w:jc w:val="center"/>
+      </w:pPr>
+      <w:r>
+        <w:t xml:space="preserve">Figure </w:t>
+      </w:r>
+      <w:r>
+        <w:t>2-8</w:t>
+      </w:r>
+      <w:r>
+        <w:t xml:space="preserve">: Screenshot of </w:t>
+      </w:r>
+      <w:r>
+        <w:t>the complete</w:t>
+      </w:r>
+      <w:r>
+        <w:t xml:space="preserve"> FrmPizzaMaker.cs showing the partial class organized with every method and summary collapsed.</w:t>
       </w:r>
     </w:p>
     <w:p/>
@@ -707,6 +1288,120 @@
       <w:pPr>
         <w:jc w:val="center"/>
         <w:rPr>
+          <w:sz w:val="28"/>
+          <w:szCs w:val="28"/>
+        </w:rPr>
+      </w:pPr>
+      <w:r>
+        <w:rPr>
+          <w:sz w:val="28"/>
+          <w:szCs w:val="28"/>
+        </w:rPr>
+        <w:t>UML Class Diagram</w:t>
+      </w:r>
+    </w:p>
+    <w:p>
+      <w:pPr>
+        <w:jc w:val="center"/>
+        <w:rPr>
+          <w:sz w:val="28"/>
+          <w:szCs w:val="28"/>
+        </w:rPr>
+      </w:pPr>
+    </w:p>
+    <w:p>
+      <w:pPr>
+        <w:jc w:val="center"/>
+      </w:pPr>
+      <w:r>
+        <w:rPr>
+          <w:noProof/>
+        </w:rPr>
+        <w:drawing>
+          <wp:inline distT="114300" distB="114300" distL="114300" distR="114300" wp14:anchorId="29E7A03C" wp14:editId="515DF102">
+            <wp:extent cx="5943600" cy="2194560"/>
+            <wp:effectExtent l="0" t="0" r="0" b="0"/>
+            <wp:docPr id="1476344475" name="image1.jpg"/>
+            <wp:cNvGraphicFramePr>
+              <a:graphicFrameLocks xmlns:a="http://schemas.openxmlformats.org/drawingml/2006/main" noChangeAspect="1"/>
+            </wp:cNvGraphicFramePr>
+            <a:graphic xmlns:a="http://schemas.openxmlformats.org/drawingml/2006/main">
+              <a:graphicData uri="http://schemas.openxmlformats.org/drawingml/2006/picture">
+                <pic:pic xmlns:pic="http://schemas.openxmlformats.org/drawingml/2006/picture">
+                  <pic:nvPicPr>
+                    <pic:cNvPr id="1476344475" name="image1.jpg"/>
+                    <pic:cNvPicPr/>
+                  </pic:nvPicPr>
+                  <pic:blipFill>
+                    <a:blip r:embed="rId16" cstate="print">
+                      <a:extLst>
+                        <a:ext uri="{28A0092B-C50C-407E-A947-70E740481C1C}">
+                          <a14:useLocalDpi xmlns:a14="http://schemas.microsoft.com/office/drawing/2010/main" val="0"/>
+                        </a:ext>
+                      </a:extLst>
+                    </a:blip>
+                    <a:stretch>
+                      <a:fillRect/>
+                    </a:stretch>
+                  </pic:blipFill>
+                  <pic:spPr>
+                    <a:xfrm>
+                      <a:off x="0" y="0"/>
+                      <a:ext cx="5943600" cy="2194560"/>
+                    </a:xfrm>
+                    <a:prstGeom prst="rect">
+                      <a:avLst/>
+                    </a:prstGeom>
+                    <a:ln/>
+                  </pic:spPr>
+                </pic:pic>
+              </a:graphicData>
+            </a:graphic>
+          </wp:inline>
+        </w:drawing>
+      </w:r>
+    </w:p>
+    <w:p>
+      <w:pPr>
+        <w:jc w:val="center"/>
+      </w:pPr>
+      <w:r>
+        <w:t xml:space="preserve">Figure </w:t>
+      </w:r>
+      <w:r>
+        <w:t>2-9</w:t>
+      </w:r>
+      <w:r>
+        <w:t>: UML Class Diagram</w:t>
+      </w:r>
+      <w:r>
+        <w:t xml:space="preserve"> of the Pizza </w:t>
+      </w:r>
+      <w:r>
+        <w:t>Maker form and the PizzaModel class.</w:t>
+      </w:r>
+    </w:p>
+    <w:p>
+      <w:pPr>
+        <w:jc w:val="center"/>
+      </w:pPr>
+    </w:p>
+    <w:p>
+      <w:pPr>
+        <w:jc w:val="center"/>
+      </w:pPr>
+    </w:p>
+    <w:p>
+      <w:pPr>
+        <w:jc w:val="center"/>
+      </w:pPr>
+    </w:p>
+    <w:p/>
+    <w:p/>
+    <w:p>
+      <w:pPr>
+        <w:jc w:val="center"/>
+        <w:rPr>
           <w:b/>
           <w:sz w:val="28"/>
           <w:szCs w:val="28"/>
@@ -718,7 +1413,16 @@
           <w:sz w:val="28"/>
           <w:szCs w:val="28"/>
         </w:rPr>
-        <w:t>Part 2</w:t>
+        <w:lastRenderedPageBreak/>
+        <w:t xml:space="preserve">Part </w:t>
+      </w:r>
+      <w:r>
+        <w:rPr>
+          <w:b/>
+          <w:sz w:val="28"/>
+          <w:szCs w:val="28"/>
+        </w:rPr>
+        <w:t>3</w:t>
       </w:r>
     </w:p>
     <w:p>

</xml_diff>

<commit_message>
Completed all work on Activity 4 before implementing challenges.
</commit_message>
<xml_diff>
--- a/Activity4/CST-250_Activity4_ChadGalloway.docx
+++ b/Activity4/CST-250_Activity4_ChadGalloway.docx
@@ -772,6 +772,9 @@
         <w:t>FrmPizzaMaker</w:t>
       </w:r>
       <w:r>
+        <w:t>.cs</w:t>
+      </w:r>
+      <w:r>
         <w:t xml:space="preserve"> citations and constructor</w:t>
       </w:r>
     </w:p>
@@ -843,7 +846,13 @@
         <w:t>2-3</w:t>
       </w:r>
       <w:r>
-        <w:t>: Screenshot of PizzaModel citations and constructor</w:t>
+        <w:t>: Screenshot of PizzaModel</w:t>
+      </w:r>
+      <w:r>
+        <w:t>.cs</w:t>
+      </w:r>
+      <w:r>
+        <w:t xml:space="preserve"> citations and constructor</w:t>
       </w:r>
     </w:p>
     <w:p/>
@@ -914,16 +923,31 @@
         <w:t xml:space="preserve">: Screenshot of </w:t>
       </w:r>
       <w:r>
-        <w:t>Enable pizza creation,</w:t>
-      </w:r>
-      <w:r>
-        <w:t xml:space="preserve"> txt name leave, and chb ingredient</w:t>
-      </w:r>
-      <w:r>
-        <w:t>s checked changed eh</w:t>
-      </w:r>
-      <w:r>
-        <w:t xml:space="preserve"> methods.</w:t>
+        <w:t>Enable</w:t>
+      </w:r>
+      <w:r>
+        <w:t>PizzaCreation</w:t>
+      </w:r>
+      <w:r>
+        <w:t>,</w:t>
+      </w:r>
+      <w:r>
+        <w:t xml:space="preserve"> </w:t>
+      </w:r>
+      <w:r>
+        <w:t>TxtNameLeaveEH</w:t>
+      </w:r>
+      <w:r>
+        <w:t xml:space="preserve">, and </w:t>
+      </w:r>
+      <w:r>
+        <w:t>Chb</w:t>
+      </w:r>
+      <w:r>
+        <w:t xml:space="preserve">IngredientsCheckedChangedEH </w:t>
+      </w:r>
+      <w:r>
+        <w:t>methods.</w:t>
       </w:r>
     </w:p>
     <w:p>
@@ -997,13 +1021,22 @@
         <w:t xml:space="preserve">: Screenshot of </w:t>
       </w:r>
       <w:r>
-        <w:t>Lsb strange add ons selected index changed eh</w:t>
-      </w:r>
-      <w:r>
-        <w:t xml:space="preserve">, update price, and </w:t>
-      </w:r>
-      <w:r>
-        <w:t>rdo crust checked changed eh methods</w:t>
+        <w:t>LsbStrangeAddOnsSelectedIndexChangedEH</w:t>
+      </w:r>
+      <w:r>
+        <w:t xml:space="preserve">, </w:t>
+      </w:r>
+      <w:r>
+        <w:t>UpdatePrice</w:t>
+      </w:r>
+      <w:r>
+        <w:t xml:space="preserve">, and </w:t>
+      </w:r>
+      <w:r>
+        <w:t>RdoCrustCheckedChangedEH</w:t>
+      </w:r>
+      <w:r>
+        <w:t xml:space="preserve"> methods</w:t>
       </w:r>
       <w:r>
         <w:t>.</w:t>
@@ -1086,19 +1119,22 @@
         <w:t xml:space="preserve">: Screenshot of </w:t>
       </w:r>
       <w:r>
-        <w:t>Hsb extra goodies value change eh</w:t>
-      </w:r>
-      <w:r>
-        <w:t>, dtp deli</w:t>
-      </w:r>
-      <w:r>
-        <w:t>v</w:t>
-      </w:r>
-      <w:r>
-        <w:t>ery time value changed eh, and</w:t>
-      </w:r>
-      <w:r>
-        <w:t xml:space="preserve"> pic pizza box color click eh</w:t>
+        <w:t>HsbExtraGoodiesValueChangedEH</w:t>
+      </w:r>
+      <w:r>
+        <w:t xml:space="preserve">, </w:t>
+      </w:r>
+      <w:r>
+        <w:t>DtpDeliveryTimeValueChangedEH</w:t>
+      </w:r>
+      <w:r>
+        <w:t>, and</w:t>
+      </w:r>
+      <w:r>
+        <w:t xml:space="preserve"> </w:t>
+      </w:r>
+      <w:r>
+        <w:t>PicPizzaBoxColorClickEH</w:t>
       </w:r>
       <w:r>
         <w:t xml:space="preserve"> methods.</w:t>
@@ -1175,10 +1211,22 @@
         <w:t xml:space="preserve">: Screenshot of </w:t>
       </w:r>
       <w:r>
-        <w:t>reset form and reset controls</w:t>
-      </w:r>
-      <w:r>
-        <w:t xml:space="preserve"> methods.</w:t>
+        <w:t>ResetFor</w:t>
+      </w:r>
+      <w:r>
+        <w:t>m</w:t>
+      </w:r>
+      <w:r>
+        <w:t xml:space="preserve"> and </w:t>
+      </w:r>
+      <w:r>
+        <w:t>ResetControls</w:t>
+      </w:r>
+      <w:r>
+        <w:t xml:space="preserve"> </w:t>
+      </w:r>
+      <w:r>
+        <w:t>methods.</w:t>
       </w:r>
       <w:r>
         <w:t xml:space="preserve"> (Note: some of the cases are collapse</w:t>
@@ -1274,10 +1322,7 @@
         <w:t>2-8</w:t>
       </w:r>
       <w:r>
-        <w:t xml:space="preserve">: Screenshot of </w:t>
-      </w:r>
-      <w:r>
-        <w:t>the complete</w:t>
+        <w:t>: Screenshot of the complete</w:t>
       </w:r>
       <w:r>
         <w:t xml:space="preserve"> FrmPizzaMaker.cs showing the partial class organized with every method and summary collapsed.</w:t>
@@ -1427,33 +1472,26 @@
     </w:p>
     <w:p>
       <w:pPr>
-        <w:rPr>
-          <w:lang w:val="en-US"/>
-        </w:rPr>
-      </w:pPr>
-    </w:p>
-    <w:p>
-      <w:pPr>
-        <w:jc w:val="center"/>
-        <w:rPr>
-          <w:sz w:val="28"/>
-          <w:szCs w:val="28"/>
-        </w:rPr>
-      </w:pPr>
-      <w:r>
-        <w:rPr>
-          <w:sz w:val="28"/>
-          <w:szCs w:val="28"/>
-        </w:rPr>
-        <w:t>FLOW CHART</w:t>
-      </w:r>
-    </w:p>
-    <w:p>
-      <w:pPr>
-        <w:jc w:val="center"/>
-        <w:rPr>
-          <w:sz w:val="28"/>
-          <w:szCs w:val="28"/>
+        <w:jc w:val="center"/>
+        <w:rPr>
+          <w:sz w:val="28"/>
+          <w:szCs w:val="28"/>
+        </w:rPr>
+      </w:pPr>
+      <w:r>
+        <w:rPr>
+          <w:sz w:val="28"/>
+          <w:szCs w:val="28"/>
+        </w:rPr>
+        <w:t>Screen Shots</w:t>
+      </w:r>
+    </w:p>
+    <w:p>
+      <w:pPr>
+        <w:jc w:val="center"/>
+        <w:rPr>
+          <w:sz w:val="16"/>
+          <w:szCs w:val="16"/>
         </w:rPr>
       </w:pPr>
     </w:p>
@@ -1466,21 +1504,28 @@
           <w:noProof/>
         </w:rPr>
         <w:drawing>
-          <wp:inline distT="114300" distB="114300" distL="114300" distR="114300" wp14:anchorId="12BAE9EA" wp14:editId="27AC631E">
-            <wp:extent cx="3148013" cy="1796373"/>
-            <wp:effectExtent l="0" t="0" r="0" b="0"/>
-            <wp:docPr id="1672752189" name="image1.jpg"/>
-            <wp:cNvGraphicFramePr/>
+          <wp:inline distT="114300" distB="114300" distL="114300" distR="114300" wp14:anchorId="77D189C9" wp14:editId="02E2762E">
+            <wp:extent cx="5029200" cy="3822192"/>
+            <wp:effectExtent l="0" t="0" r="0" b="6985"/>
+            <wp:docPr id="1493560320" name="image1.jpg"/>
+            <wp:cNvGraphicFramePr>
+              <a:graphicFrameLocks xmlns:a="http://schemas.openxmlformats.org/drawingml/2006/main" noChangeAspect="1"/>
+            </wp:cNvGraphicFramePr>
             <a:graphic xmlns:a="http://schemas.openxmlformats.org/drawingml/2006/main">
               <a:graphicData uri="http://schemas.openxmlformats.org/drawingml/2006/picture">
                 <pic:pic xmlns:pic="http://schemas.openxmlformats.org/drawingml/2006/picture">
                   <pic:nvPicPr>
-                    <pic:cNvPr id="0" name="image1.jpg"/>
-                    <pic:cNvPicPr preferRelativeResize="0"/>
+                    <pic:cNvPr id="1493560320" name="image1.jpg"/>
+                    <pic:cNvPicPr/>
                   </pic:nvPicPr>
                   <pic:blipFill>
-                    <a:blip r:embed="rId6"/>
-                    <a:srcRect/>
+                    <a:blip r:embed="rId17">
+                      <a:extLst>
+                        <a:ext uri="{28A0092B-C50C-407E-A947-70E740481C1C}">
+                          <a14:useLocalDpi xmlns:a14="http://schemas.microsoft.com/office/drawing/2010/main" val="0"/>
+                        </a:ext>
+                      </a:extLst>
+                    </a:blip>
                     <a:stretch>
                       <a:fillRect/>
                     </a:stretch>
@@ -1488,7 +1533,7 @@
                   <pic:spPr>
                     <a:xfrm>
                       <a:off x="0" y="0"/>
-                      <a:ext cx="3148013" cy="1796373"/>
+                      <a:ext cx="5029200" cy="3822192"/>
                     </a:xfrm>
                     <a:prstGeom prst="rect">
                       <a:avLst/>
@@ -1507,77 +1552,62 @@
         <w:jc w:val="center"/>
       </w:pPr>
       <w:r>
-        <w:t>Figure X: Flow chart of XXXXXXX</w:t>
-      </w:r>
-    </w:p>
-    <w:p>
-      <w:pPr>
-        <w:jc w:val="center"/>
-      </w:pPr>
-    </w:p>
-    <w:p>
-      <w:r>
-        <w:rPr>
-          <w:lang w:val="en-US"/>
-        </w:rPr>
-        <w:t>"Lorem ipsum dolor sit amet, consectetur adipiscing elit, sed do eiusmod tempor incididunt ut labore et dolore magna aliqua. Ut enim ad minim veniam, quis nostrud exercitation ullamco laboris nisi ut aliquip ex ea commodo consequat. Duis aute irure dolor in reprehenderit in voluptate velit esse cillum dolore eu fugiat nulla pariatur. Excepteur sint occaecat cupidatat non proident, sunt in culpa qui officia deserunt mollit anim id est laborum."</w:t>
-      </w:r>
-    </w:p>
-    <w:p>
-      <w:r>
-        <w:br w:type="page"/>
+        <w:t xml:space="preserve">Figure </w:t>
+      </w:r>
+      <w:r>
+        <w:t>3-1</w:t>
+      </w:r>
+      <w:r>
+        <w:t xml:space="preserve">: Part </w:t>
+      </w:r>
+      <w:r>
+        <w:t>3</w:t>
+      </w:r>
+      <w:r>
+        <w:t xml:space="preserve"> App Running</w:t>
+      </w:r>
+      <w:r>
+        <w:t xml:space="preserve"> with save order </w:t>
+      </w:r>
+      <w:r>
+        <w:t>confirmation</w:t>
+      </w:r>
+      <w:r>
+        <w:t xml:space="preserve"> message box on screen</w:t>
       </w:r>
     </w:p>
     <w:p/>
     <w:p>
       <w:pPr>
         <w:jc w:val="center"/>
-        <w:rPr>
-          <w:sz w:val="28"/>
-          <w:szCs w:val="28"/>
-        </w:rPr>
-      </w:pPr>
-      <w:r>
-        <w:rPr>
-          <w:sz w:val="28"/>
-          <w:szCs w:val="28"/>
-        </w:rPr>
-        <w:t>UML Class Diagram</w:t>
-      </w:r>
-    </w:p>
-    <w:p>
-      <w:pPr>
-        <w:jc w:val="center"/>
-        <w:rPr>
-          <w:sz w:val="28"/>
-          <w:szCs w:val="28"/>
-        </w:rPr>
-      </w:pPr>
-    </w:p>
-    <w:p>
-      <w:pPr>
-        <w:jc w:val="center"/>
       </w:pPr>
       <w:r>
         <w:rPr>
           <w:noProof/>
         </w:rPr>
         <w:drawing>
-          <wp:inline distT="114300" distB="114300" distL="114300" distR="114300" wp14:anchorId="1B6336B7" wp14:editId="4836C287">
-            <wp:extent cx="3148013" cy="1796373"/>
-            <wp:effectExtent l="0" t="0" r="0" b="0"/>
-            <wp:docPr id="425721919" name="image1.jpg"/>
-            <wp:cNvGraphicFramePr/>
+          <wp:inline distT="114300" distB="114300" distL="114300" distR="114300" wp14:anchorId="59C475E7" wp14:editId="44DC7656">
+            <wp:extent cx="5486400" cy="3118104"/>
+            <wp:effectExtent l="0" t="0" r="0" b="6350"/>
+            <wp:docPr id="1643367640" name="image1.jpg"/>
+            <wp:cNvGraphicFramePr>
+              <a:graphicFrameLocks xmlns:a="http://schemas.openxmlformats.org/drawingml/2006/main" noChangeAspect="1"/>
+            </wp:cNvGraphicFramePr>
             <a:graphic xmlns:a="http://schemas.openxmlformats.org/drawingml/2006/main">
               <a:graphicData uri="http://schemas.openxmlformats.org/drawingml/2006/picture">
                 <pic:pic xmlns:pic="http://schemas.openxmlformats.org/drawingml/2006/picture">
                   <pic:nvPicPr>
-                    <pic:cNvPr id="0" name="image1.jpg"/>
-                    <pic:cNvPicPr preferRelativeResize="0"/>
+                    <pic:cNvPr id="1643367640" name="image1.jpg"/>
+                    <pic:cNvPicPr/>
                   </pic:nvPicPr>
                   <pic:blipFill>
-                    <a:blip r:embed="rId6"/>
-                    <a:srcRect/>
+                    <a:blip r:embed="rId18">
+                      <a:extLst>
+                        <a:ext uri="{28A0092B-C50C-407E-A947-70E740481C1C}">
+                          <a14:useLocalDpi xmlns:a14="http://schemas.microsoft.com/office/drawing/2010/main" val="0"/>
+                        </a:ext>
+                      </a:extLst>
+                    </a:blip>
                     <a:stretch>
                       <a:fillRect/>
                     </a:stretch>
@@ -1585,7 +1615,7 @@
                   <pic:spPr>
                     <a:xfrm>
                       <a:off x="0" y="0"/>
-                      <a:ext cx="3148013" cy="1796373"/>
+                      <a:ext cx="5486400" cy="3118104"/>
                     </a:xfrm>
                     <a:prstGeom prst="rect">
                       <a:avLst/>
@@ -1604,68 +1634,28 @@
         <w:jc w:val="center"/>
       </w:pPr>
       <w:r>
-        <w:t>Figure X: UML Class Diagram</w:t>
-      </w:r>
-    </w:p>
-    <w:p>
-      <w:pPr>
-        <w:jc w:val="center"/>
-      </w:pPr>
-    </w:p>
-    <w:p>
-      <w:r>
-        <w:rPr>
-          <w:lang w:val="en-US"/>
-        </w:rPr>
-        <w:t xml:space="preserve">Lorem ipsum dolor sit amet, consectetur adipiscing elit, sed do eiusmod tempor incididunt ut labore et dolore magna aliqua. </w:t>
-      </w:r>
-      <w:r>
-        <w:rPr>
-          <w:lang w:val="pt-BR"/>
-        </w:rPr>
-        <w:t xml:space="preserve">Ut enim ad minim veniam, quis nostrud exercitation ullamco laboris nisi ut aliquip ex ea commodo consequat. </w:t>
-      </w:r>
-      <w:r>
-        <w:rPr>
-          <w:lang w:val="en-US"/>
-        </w:rPr>
-        <w:t>Duis aute irure dolor in reprehenderit in voluptate velit esse cillum dolore eu fugiat nulla pariatur. Excepteur sint occaecat cupidatat non proident, sunt in culpa qui officia deserunt mollit anim id est laborum.</w:t>
-      </w:r>
-    </w:p>
-    <w:p>
-      <w:pPr>
-        <w:jc w:val="center"/>
-      </w:pPr>
-      <w:r>
-        <w:br w:type="page"/>
-      </w:r>
-    </w:p>
-    <w:p>
-      <w:pPr>
-        <w:jc w:val="center"/>
-        <w:rPr>
-          <w:sz w:val="28"/>
-          <w:szCs w:val="28"/>
-        </w:rPr>
-      </w:pPr>
-      <w:r>
-        <w:rPr>
-          <w:sz w:val="28"/>
-          <w:szCs w:val="28"/>
-        </w:rPr>
-        <w:lastRenderedPageBreak/>
-        <w:t>Screen Shots</w:t>
-      </w:r>
-    </w:p>
-    <w:p>
-      <w:pPr>
-        <w:jc w:val="center"/>
-        <w:rPr>
-          <w:sz w:val="28"/>
-          <w:szCs w:val="28"/>
-        </w:rPr>
-      </w:pPr>
-    </w:p>
+        <w:t xml:space="preserve">Figure </w:t>
+      </w:r>
+      <w:r>
+        <w:t>3-2</w:t>
+      </w:r>
+      <w:r>
+        <w:t>: Screenshot of successful output</w:t>
+      </w:r>
+      <w:r>
+        <w:t xml:space="preserve"> to the file</w:t>
+      </w:r>
+      <w:r>
+        <w:t xml:space="preserve"> for the above screen shot in figure 3-1</w:t>
+      </w:r>
+    </w:p>
+    <w:p>
+      <w:pPr>
+        <w:jc w:val="center"/>
+      </w:pPr>
+    </w:p>
+    <w:p/>
+    <w:p/>
     <w:p>
       <w:pPr>
         <w:jc w:val="center"/>
@@ -1675,21 +1665,28 @@
           <w:noProof/>
         </w:rPr>
         <w:drawing>
-          <wp:inline distT="114300" distB="114300" distL="114300" distR="114300" wp14:anchorId="77D189C9" wp14:editId="3C9FCE91">
-            <wp:extent cx="3148013" cy="1796373"/>
+          <wp:inline distT="114300" distB="114300" distL="114300" distR="114300" wp14:anchorId="59FA81E5" wp14:editId="678D70CC">
+            <wp:extent cx="5943600" cy="1965960"/>
             <wp:effectExtent l="0" t="0" r="0" b="0"/>
-            <wp:docPr id="1493560320" name="image1.jpg"/>
-            <wp:cNvGraphicFramePr/>
+            <wp:docPr id="1004731626" name="image1.jpg"/>
+            <wp:cNvGraphicFramePr>
+              <a:graphicFrameLocks xmlns:a="http://schemas.openxmlformats.org/drawingml/2006/main" noChangeAspect="1"/>
+            </wp:cNvGraphicFramePr>
             <a:graphic xmlns:a="http://schemas.openxmlformats.org/drawingml/2006/main">
               <a:graphicData uri="http://schemas.openxmlformats.org/drawingml/2006/picture">
                 <pic:pic xmlns:pic="http://schemas.openxmlformats.org/drawingml/2006/picture">
                   <pic:nvPicPr>
-                    <pic:cNvPr id="0" name="image1.jpg"/>
-                    <pic:cNvPicPr preferRelativeResize="0"/>
+                    <pic:cNvPr id="1004731626" name="image1.jpg"/>
+                    <pic:cNvPicPr/>
                   </pic:nvPicPr>
                   <pic:blipFill>
-                    <a:blip r:embed="rId6"/>
-                    <a:srcRect/>
+                    <a:blip r:embed="rId19" cstate="print">
+                      <a:extLst>
+                        <a:ext uri="{28A0092B-C50C-407E-A947-70E740481C1C}">
+                          <a14:useLocalDpi xmlns:a14="http://schemas.microsoft.com/office/drawing/2010/main" val="0"/>
+                        </a:ext>
+                      </a:extLst>
+                    </a:blip>
                     <a:stretch>
                       <a:fillRect/>
                     </a:stretch>
@@ -1697,7 +1694,7 @@
                   <pic:spPr>
                     <a:xfrm>
                       <a:off x="0" y="0"/>
-                      <a:ext cx="3148013" cy="1796373"/>
+                      <a:ext cx="5943600" cy="1965960"/>
                     </a:xfrm>
                     <a:prstGeom prst="rect">
                       <a:avLst/>
@@ -1716,50 +1713,22 @@
         <w:jc w:val="center"/>
       </w:pPr>
       <w:r>
-        <w:t>Figure X: Part 2 App Running</w:t>
-      </w:r>
-    </w:p>
-    <w:p>
-      <w:pPr>
-        <w:jc w:val="center"/>
-      </w:pPr>
-    </w:p>
-    <w:p>
-      <w:pPr>
-        <w:rPr>
-          <w:lang w:val="en-US"/>
-        </w:rPr>
-      </w:pPr>
-      <w:r>
-        <w:rPr>
-          <w:lang w:val="en-US"/>
-        </w:rPr>
-        <w:t xml:space="preserve">Lorem ipsum dolor sit amet, consectetur adipiscing elit, sed do eiusmod tempor incididunt ut labore et dolore magna aliqua. </w:t>
-      </w:r>
-      <w:r>
-        <w:rPr>
-          <w:lang w:val="pt-BR"/>
-        </w:rPr>
-        <w:t xml:space="preserve">Ut enim ad minim veniam, quis nostrud exercitation ullamco laboris nisi ut aliquip ex ea commodo consequat. </w:t>
-      </w:r>
-      <w:r>
-        <w:rPr>
-          <w:lang w:val="en-US"/>
-        </w:rPr>
-        <w:t>Duis aute irure dolor in reprehenderit in voluptate velit esse cillum dolore eu fugiat nulla pariatur. Excepteur sint occaecat cupidatat non proident, sunt in culpa qui officia deserunt mollit anim id est laborum.</w:t>
+        <w:t xml:space="preserve">Figure </w:t>
+      </w:r>
+      <w:r>
+        <w:t>3-3</w:t>
+      </w:r>
+      <w:r>
+        <w:t xml:space="preserve">: Screenshot of </w:t>
+      </w:r>
+      <w:r>
+        <w:t>citations and constructor for the</w:t>
+      </w:r>
+      <w:r>
+        <w:t xml:space="preserve"> FrmOrderDetails</w:t>
       </w:r>
     </w:p>
     <w:p/>
-    <w:p/>
-    <w:p>
-      <w:pPr>
-        <w:jc w:val="center"/>
-        <w:rPr>
-          <w:sz w:val="28"/>
-          <w:szCs w:val="28"/>
-        </w:rPr>
-      </w:pPr>
-    </w:p>
     <w:p>
       <w:pPr>
         <w:jc w:val="center"/>
@@ -1769,21 +1738,28 @@
           <w:noProof/>
         </w:rPr>
         <w:drawing>
-          <wp:inline distT="114300" distB="114300" distL="114300" distR="114300" wp14:anchorId="59C475E7" wp14:editId="60EC07F7">
-            <wp:extent cx="3148013" cy="1796373"/>
-            <wp:effectExtent l="0" t="0" r="0" b="0"/>
-            <wp:docPr id="1643367640" name="image1.jpg"/>
-            <wp:cNvGraphicFramePr/>
+          <wp:inline distT="114300" distB="114300" distL="114300" distR="114300" wp14:anchorId="7DFB8CFA" wp14:editId="5883477C">
+            <wp:extent cx="5943600" cy="3026664"/>
+            <wp:effectExtent l="0" t="0" r="0" b="2540"/>
+            <wp:docPr id="1655366810" name="image1.jpg"/>
+            <wp:cNvGraphicFramePr>
+              <a:graphicFrameLocks xmlns:a="http://schemas.openxmlformats.org/drawingml/2006/main" noChangeAspect="1"/>
+            </wp:cNvGraphicFramePr>
             <a:graphic xmlns:a="http://schemas.openxmlformats.org/drawingml/2006/main">
               <a:graphicData uri="http://schemas.openxmlformats.org/drawingml/2006/picture">
                 <pic:pic xmlns:pic="http://schemas.openxmlformats.org/drawingml/2006/picture">
                   <pic:nvPicPr>
-                    <pic:cNvPr id="0" name="image1.jpg"/>
-                    <pic:cNvPicPr preferRelativeResize="0"/>
+                    <pic:cNvPr id="1655366810" name="image1.jpg"/>
+                    <pic:cNvPicPr/>
                   </pic:nvPicPr>
                   <pic:blipFill>
-                    <a:blip r:embed="rId6"/>
-                    <a:srcRect/>
+                    <a:blip r:embed="rId20" cstate="print">
+                      <a:extLst>
+                        <a:ext uri="{28A0092B-C50C-407E-A947-70E740481C1C}">
+                          <a14:useLocalDpi xmlns:a14="http://schemas.microsoft.com/office/drawing/2010/main" val="0"/>
+                        </a:ext>
+                      </a:extLst>
+                    </a:blip>
                     <a:stretch>
                       <a:fillRect/>
                     </a:stretch>
@@ -1791,7 +1767,7 @@
                   <pic:spPr>
                     <a:xfrm>
                       <a:off x="0" y="0"/>
-                      <a:ext cx="3148013" cy="1796373"/>
+                      <a:ext cx="5943600" cy="3026664"/>
                     </a:xfrm>
                     <a:prstGeom prst="rect">
                       <a:avLst/>
@@ -1810,23 +1786,45 @@
         <w:jc w:val="center"/>
       </w:pPr>
       <w:r>
-        <w:t>Figure X: Screenshot of successful output</w:t>
-      </w:r>
-    </w:p>
-    <w:p>
-      <w:pPr>
-        <w:jc w:val="center"/>
-      </w:pPr>
-    </w:p>
-    <w:p>
+        <w:t>Figure 3-</w:t>
+      </w:r>
+      <w:r>
+        <w:t>4</w:t>
+      </w:r>
+      <w:r>
+        <w:t xml:space="preserve">: Screenshot of </w:t>
+      </w:r>
+      <w:r>
+        <w:t>Display</w:t>
+      </w:r>
+      <w:r>
+        <w:t xml:space="preserve">Pizzas and </w:t>
+      </w:r>
       <w:r>
         <w:rPr>
           <w:lang w:val="en-US"/>
         </w:rPr>
-        <w:t>Lorem ipsum dolor sit amet, consectetur adipiscing elit, sed do eiusmod tempor incididunt ut labore et dolore magna aliqua. Ut enim ad minim veniam, quis nostrud exercitation ullamco laboris nisi ut aliquip ex ea commodo consequat. Duis aute irure dolor in reprehenderit in voluptate velit esse cillum dolore eu fugiat nulla pariatur. Excepteur sint occaecat cupidatat non proident, sunt in culpa qui officia deserunt mollit anim id est laborum.</w:t>
-      </w:r>
-    </w:p>
-    <w:p/>
+        <w:t>BtnSaveOrderClickEH</w:t>
+      </w:r>
+      <w:r>
+        <w:rPr>
+          <w:lang w:val="en-US"/>
+        </w:rPr>
+        <w:t xml:space="preserve"> in the F</w:t>
+      </w:r>
+      <w:r>
+        <w:rPr>
+          <w:lang w:val="en-US"/>
+        </w:rPr>
+        <w:t>r</w:t>
+      </w:r>
+      <w:r>
+        <w:rPr>
+          <w:lang w:val="en-US"/>
+        </w:rPr>
+        <w:t>mOrderDetails</w:t>
+      </w:r>
+    </w:p>
     <w:p/>
     <w:p>
       <w:pPr>
@@ -1838,21 +1836,28 @@
         </w:rPr>
         <w:lastRenderedPageBreak/>
         <w:drawing>
-          <wp:inline distT="114300" distB="114300" distL="114300" distR="114300" wp14:anchorId="59FA81E5" wp14:editId="7A560EFF">
-            <wp:extent cx="3148013" cy="1796373"/>
+          <wp:inline distT="114300" distB="114300" distL="114300" distR="114300" wp14:anchorId="4009A76E" wp14:editId="1CFE3B09">
+            <wp:extent cx="5943600" cy="2752344"/>
             <wp:effectExtent l="0" t="0" r="0" b="0"/>
-            <wp:docPr id="1004731626" name="image1.jpg"/>
-            <wp:cNvGraphicFramePr/>
+            <wp:docPr id="33189770" name="image1.jpg"/>
+            <wp:cNvGraphicFramePr>
+              <a:graphicFrameLocks xmlns:a="http://schemas.openxmlformats.org/drawingml/2006/main" noChangeAspect="1"/>
+            </wp:cNvGraphicFramePr>
             <a:graphic xmlns:a="http://schemas.openxmlformats.org/drawingml/2006/main">
               <a:graphicData uri="http://schemas.openxmlformats.org/drawingml/2006/picture">
                 <pic:pic xmlns:pic="http://schemas.openxmlformats.org/drawingml/2006/picture">
                   <pic:nvPicPr>
-                    <pic:cNvPr id="0" name="image1.jpg"/>
-                    <pic:cNvPicPr preferRelativeResize="0"/>
+                    <pic:cNvPr id="33189770" name="image1.jpg"/>
+                    <pic:cNvPicPr/>
                   </pic:nvPicPr>
                   <pic:blipFill>
-                    <a:blip r:embed="rId6"/>
-                    <a:srcRect/>
+                    <a:blip r:embed="rId21" cstate="print">
+                      <a:extLst>
+                        <a:ext uri="{28A0092B-C50C-407E-A947-70E740481C1C}">
+                          <a14:useLocalDpi xmlns:a14="http://schemas.microsoft.com/office/drawing/2010/main" val="0"/>
+                        </a:ext>
+                      </a:extLst>
+                    </a:blip>
                     <a:stretch>
                       <a:fillRect/>
                     </a:stretch>
@@ -1860,7 +1865,7 @@
                   <pic:spPr>
                     <a:xfrm>
                       <a:off x="0" y="0"/>
-                      <a:ext cx="3148013" cy="1796373"/>
+                      <a:ext cx="5943600" cy="2752344"/>
                     </a:xfrm>
                     <a:prstGeom prst="rect">
                       <a:avLst/>
@@ -1879,33 +1884,301 @@
         <w:jc w:val="center"/>
       </w:pPr>
       <w:r>
-        <w:t>Figure X: Screenshot of Error Handling</w:t>
-      </w:r>
-    </w:p>
-    <w:p>
-      <w:pPr>
-        <w:jc w:val="center"/>
-      </w:pPr>
-    </w:p>
-    <w:p>
-      <w:r>
-        <w:rPr>
-          <w:lang w:val="en-US"/>
-        </w:rPr>
-        <w:t>Lorem ipsum dolor sit amet, consectetur adipiscing elit, sed do eiusmod tempor incididunt ut labore et dolore magna aliqua. Ut enim ad minim veniam, quis nostrud exercitation ullamco laboris nisi ut aliquip ex ea commodo consequat. Duis aute irure dolor in reprehenderit in voluptate velit esse cillum dolore eu fugiat nulla pariatur. Excepteur sint occaecat cupidatat non proident, sunt in culpa qui officia deserunt mollit anim id est laborum.</w:t>
+        <w:t>Figure 3-</w:t>
+      </w:r>
+      <w:r>
+        <w:t>5</w:t>
+      </w:r>
+      <w:r>
+        <w:t xml:space="preserve">: Screenshot of </w:t>
+      </w:r>
+      <w:r>
+        <w:t>the BtnCreatePizzaClickEH, and BtnSeeFullOrderClickEH methods in FrmPizzaMaker.</w:t>
+      </w:r>
+    </w:p>
+    <w:p>
+      <w:pPr>
+        <w:jc w:val="center"/>
+      </w:pPr>
+    </w:p>
+    <w:p>
+      <w:pPr>
+        <w:jc w:val="center"/>
+      </w:pPr>
+      <w:r>
+        <w:rPr>
+          <w:noProof/>
+        </w:rPr>
+        <w:drawing>
+          <wp:inline distT="114300" distB="114300" distL="114300" distR="114300" wp14:anchorId="79332B06" wp14:editId="4121B975">
+            <wp:extent cx="5943600" cy="2313432"/>
+            <wp:effectExtent l="0" t="0" r="0" b="0"/>
+            <wp:docPr id="1483111982" name="image1.jpg"/>
+            <wp:cNvGraphicFramePr>
+              <a:graphicFrameLocks xmlns:a="http://schemas.openxmlformats.org/drawingml/2006/main" noChangeAspect="1"/>
+            </wp:cNvGraphicFramePr>
+            <a:graphic xmlns:a="http://schemas.openxmlformats.org/drawingml/2006/main">
+              <a:graphicData uri="http://schemas.openxmlformats.org/drawingml/2006/picture">
+                <pic:pic xmlns:pic="http://schemas.openxmlformats.org/drawingml/2006/picture">
+                  <pic:nvPicPr>
+                    <pic:cNvPr id="1483111982" name="image1.jpg"/>
+                    <pic:cNvPicPr/>
+                  </pic:nvPicPr>
+                  <pic:blipFill>
+                    <a:blip r:embed="rId22" cstate="print">
+                      <a:extLst>
+                        <a:ext uri="{28A0092B-C50C-407E-A947-70E740481C1C}">
+                          <a14:useLocalDpi xmlns:a14="http://schemas.microsoft.com/office/drawing/2010/main" val="0"/>
+                        </a:ext>
+                      </a:extLst>
+                    </a:blip>
+                    <a:stretch>
+                      <a:fillRect/>
+                    </a:stretch>
+                  </pic:blipFill>
+                  <pic:spPr>
+                    <a:xfrm>
+                      <a:off x="0" y="0"/>
+                      <a:ext cx="5943600" cy="2313432"/>
+                    </a:xfrm>
+                    <a:prstGeom prst="rect">
+                      <a:avLst/>
+                    </a:prstGeom>
+                    <a:ln/>
+                  </pic:spPr>
+                </pic:pic>
+              </a:graphicData>
+            </a:graphic>
+          </wp:inline>
+        </w:drawing>
+      </w:r>
+    </w:p>
+    <w:p>
+      <w:pPr>
+        <w:jc w:val="center"/>
+      </w:pPr>
+      <w:r>
+        <w:t>Figure 3-</w:t>
+      </w:r>
+      <w:r>
+        <w:t>6</w:t>
+      </w:r>
+      <w:r>
+        <w:t>: Screenshot of</w:t>
+      </w:r>
+      <w:r>
+        <w:t xml:space="preserve"> </w:t>
+      </w:r>
+      <w:r>
+        <w:t>the AddPizzaToOrder, GetPizzaOrder, and WriteOrderToFile methods in the PizzaLogic</w:t>
       </w:r>
     </w:p>
     <w:p/>
+    <w:p>
+      <w:pPr>
+        <w:jc w:val="center"/>
+      </w:pPr>
+      <w:r>
+        <w:rPr>
+          <w:b/>
+          <w:sz w:val="28"/>
+          <w:szCs w:val="28"/>
+        </w:rPr>
+        <w:br w:type="page"/>
+      </w:r>
+    </w:p>
+    <w:p>
+      <w:pPr>
+        <w:jc w:val="center"/>
+      </w:pPr>
+      <w:r>
+        <w:rPr>
+          <w:noProof/>
+        </w:rPr>
+        <w:lastRenderedPageBreak/>
+        <w:drawing>
+          <wp:inline distT="114300" distB="114300" distL="114300" distR="114300" wp14:anchorId="3127F2F9" wp14:editId="04593ED1">
+            <wp:extent cx="5943600" cy="3895344"/>
+            <wp:effectExtent l="0" t="0" r="0" b="0"/>
+            <wp:docPr id="49074556" name="image1.jpg"/>
+            <wp:cNvGraphicFramePr>
+              <a:graphicFrameLocks xmlns:a="http://schemas.openxmlformats.org/drawingml/2006/main" noChangeAspect="1"/>
+            </wp:cNvGraphicFramePr>
+            <a:graphic xmlns:a="http://schemas.openxmlformats.org/drawingml/2006/main">
+              <a:graphicData uri="http://schemas.openxmlformats.org/drawingml/2006/picture">
+                <pic:pic xmlns:pic="http://schemas.openxmlformats.org/drawingml/2006/picture">
+                  <pic:nvPicPr>
+                    <pic:cNvPr id="49074556" name="image1.jpg"/>
+                    <pic:cNvPicPr/>
+                  </pic:nvPicPr>
+                  <pic:blipFill>
+                    <a:blip r:embed="rId23" cstate="print">
+                      <a:extLst>
+                        <a:ext uri="{28A0092B-C50C-407E-A947-70E740481C1C}">
+                          <a14:useLocalDpi xmlns:a14="http://schemas.microsoft.com/office/drawing/2010/main" val="0"/>
+                        </a:ext>
+                      </a:extLst>
+                    </a:blip>
+                    <a:stretch>
+                      <a:fillRect/>
+                    </a:stretch>
+                  </pic:blipFill>
+                  <pic:spPr>
+                    <a:xfrm>
+                      <a:off x="0" y="0"/>
+                      <a:ext cx="5943600" cy="3895344"/>
+                    </a:xfrm>
+                    <a:prstGeom prst="rect">
+                      <a:avLst/>
+                    </a:prstGeom>
+                    <a:ln/>
+                  </pic:spPr>
+                </pic:pic>
+              </a:graphicData>
+            </a:graphic>
+          </wp:inline>
+        </w:drawing>
+      </w:r>
+    </w:p>
+    <w:p>
+      <w:pPr>
+        <w:jc w:val="center"/>
+      </w:pPr>
+      <w:r>
+        <w:t>Figure 3-</w:t>
+      </w:r>
+      <w:r>
+        <w:t>7</w:t>
+      </w:r>
+      <w:r>
+        <w:t xml:space="preserve">: </w:t>
+      </w:r>
+      <w:r>
+        <w:t xml:space="preserve">Screenshot of </w:t>
+      </w:r>
+      <w:r>
+        <w:t>the AddPizzaToOrder, GetPizzaOrder, and WriteOrderToFile methods in the Pizza</w:t>
+      </w:r>
+      <w:r>
+        <w:t>DAO</w:t>
+      </w:r>
+    </w:p>
     <w:p/>
     <w:p>
-      <w:r>
+      <w:pPr>
+        <w:rPr>
+          <w:sz w:val="28"/>
+          <w:szCs w:val="28"/>
+        </w:rPr>
+      </w:pPr>
+      <w:r>
+        <w:rPr>
+          <w:sz w:val="28"/>
+          <w:szCs w:val="28"/>
+        </w:rPr>
         <w:br w:type="page"/>
       </w:r>
     </w:p>
-    <w:p/>
-    <w:p>
-      <w:pPr>
-        <w:jc w:val="center"/>
+    <w:p>
+      <w:pPr>
+        <w:jc w:val="center"/>
+        <w:rPr>
+          <w:sz w:val="28"/>
+          <w:szCs w:val="28"/>
+        </w:rPr>
+      </w:pPr>
+      <w:r>
+        <w:rPr>
+          <w:sz w:val="28"/>
+          <w:szCs w:val="28"/>
+        </w:rPr>
+        <w:lastRenderedPageBreak/>
+        <w:t>UML Class Diagram</w:t>
+      </w:r>
+    </w:p>
+    <w:p>
+      <w:pPr>
+        <w:jc w:val="center"/>
+        <w:rPr>
+          <w:sz w:val="16"/>
+          <w:szCs w:val="16"/>
+        </w:rPr>
+      </w:pPr>
+    </w:p>
+    <w:p>
+      <w:pPr>
+        <w:jc w:val="center"/>
+      </w:pPr>
+      <w:r>
+        <w:rPr>
+          <w:noProof/>
+        </w:rPr>
+        <w:drawing>
+          <wp:inline distT="114300" distB="114300" distL="114300" distR="114300" wp14:anchorId="1BD1EC28" wp14:editId="0752CFE3">
+            <wp:extent cx="5943600" cy="5769864"/>
+            <wp:effectExtent l="0" t="0" r="0" b="2540"/>
+            <wp:docPr id="1394080951" name="image1.jpg"/>
+            <wp:cNvGraphicFramePr>
+              <a:graphicFrameLocks xmlns:a="http://schemas.openxmlformats.org/drawingml/2006/main" noChangeAspect="1"/>
+            </wp:cNvGraphicFramePr>
+            <a:graphic xmlns:a="http://schemas.openxmlformats.org/drawingml/2006/main">
+              <a:graphicData uri="http://schemas.openxmlformats.org/drawingml/2006/picture">
+                <pic:pic xmlns:pic="http://schemas.openxmlformats.org/drawingml/2006/picture">
+                  <pic:nvPicPr>
+                    <pic:cNvPr id="1394080951" name="image1.jpg"/>
+                    <pic:cNvPicPr/>
+                  </pic:nvPicPr>
+                  <pic:blipFill>
+                    <a:blip r:embed="rId24">
+                      <a:extLst>
+                        <a:ext uri="{28A0092B-C50C-407E-A947-70E740481C1C}">
+                          <a14:useLocalDpi xmlns:a14="http://schemas.microsoft.com/office/drawing/2010/main" val="0"/>
+                        </a:ext>
+                      </a:extLst>
+                    </a:blip>
+                    <a:stretch>
+                      <a:fillRect/>
+                    </a:stretch>
+                  </pic:blipFill>
+                  <pic:spPr>
+                    <a:xfrm>
+                      <a:off x="0" y="0"/>
+                      <a:ext cx="5943600" cy="5769864"/>
+                    </a:xfrm>
+                    <a:prstGeom prst="rect">
+                      <a:avLst/>
+                    </a:prstGeom>
+                    <a:ln/>
+                  </pic:spPr>
+                </pic:pic>
+              </a:graphicData>
+            </a:graphic>
+          </wp:inline>
+        </w:drawing>
+      </w:r>
+    </w:p>
+    <w:p>
+      <w:pPr>
+        <w:jc w:val="center"/>
+      </w:pPr>
+      <w:r>
+        <w:t xml:space="preserve">Figure </w:t>
+      </w:r>
+      <w:r>
+        <w:t>3-8</w:t>
+      </w:r>
+      <w:r>
+        <w:t>: UML Class Diagram</w:t>
+      </w:r>
+      <w:r>
+        <w:t xml:space="preserve"> for the Pizza</w:t>
+      </w:r>
+      <w:r>
+        <w:t>Maker project as it stands before challenges have been implemented.</w:t>
+      </w:r>
+    </w:p>
+    <w:p>
+      <w:pPr>
         <w:rPr>
           <w:b/>
           <w:sz w:val="28"/>
@@ -1918,6 +2191,25 @@
           <w:sz w:val="28"/>
           <w:szCs w:val="28"/>
         </w:rPr>
+        <w:br w:type="page"/>
+      </w:r>
+    </w:p>
+    <w:p>
+      <w:pPr>
+        <w:jc w:val="center"/>
+        <w:rPr>
+          <w:b/>
+          <w:sz w:val="28"/>
+          <w:szCs w:val="28"/>
+        </w:rPr>
+      </w:pPr>
+      <w:r>
+        <w:rPr>
+          <w:b/>
+          <w:sz w:val="28"/>
+          <w:szCs w:val="28"/>
+        </w:rPr>
+        <w:lastRenderedPageBreak/>
         <w:t xml:space="preserve">Part </w:t>
       </w:r>
       <w:r>
@@ -3552,7 +3844,6 @@
   <w:style w:type="character" w:default="1" w:styleId="DefaultParagraphFont">
     <w:name w:val="Default Paragraph Font"/>
     <w:uiPriority w:val="1"/>
-    <w:semiHidden/>
     <w:unhideWhenUsed/>
   </w:style>
   <w:style w:type="table" w:default="1" w:styleId="TableNormal">

</xml_diff>

<commit_message>
Finished all Milestone 4 work
</commit_message>
<xml_diff>
--- a/Activity4/CST-250_Activity4_ChadGalloway.docx
+++ b/Activity4/CST-250_Activity4_ChadGalloway.docx
@@ -72,33 +72,40 @@
           <w:sz w:val="46"/>
           <w:szCs w:val="46"/>
         </w:rPr>
-        <w:t>Nov. 09</w:t>
+        <w:t xml:space="preserve">Nov. </w:t>
       </w:r>
       <w:r>
         <w:rPr>
           <w:sz w:val="46"/>
           <w:szCs w:val="46"/>
         </w:rPr>
-        <w:t>, 2025</w:t>
-      </w:r>
-    </w:p>
-    <w:p>
-      <w:pPr>
-        <w:jc w:val="center"/>
-      </w:pPr>
+        <w:t>16</w:t>
+      </w:r>
       <w:r>
         <w:rPr>
           <w:sz w:val="46"/>
           <w:szCs w:val="46"/>
         </w:rPr>
-        <w:t xml:space="preserve">Activity </w:t>
-      </w:r>
+        <w:t>, 2025</w:t>
+      </w:r>
+    </w:p>
+    <w:p>
+      <w:pPr>
+        <w:jc w:val="center"/>
+      </w:pPr>
       <w:r>
         <w:rPr>
           <w:sz w:val="46"/>
           <w:szCs w:val="46"/>
         </w:rPr>
-        <w:t>#</w:t>
+        <w:t xml:space="preserve">Activity </w:t>
+      </w:r>
+      <w:r>
+        <w:rPr>
+          <w:sz w:val="46"/>
+          <w:szCs w:val="46"/>
+        </w:rPr>
+        <w:t>4</w:t>
       </w:r>
     </w:p>
     <w:p>
@@ -191,22 +198,23 @@
           <w:szCs w:val="46"/>
         </w:rPr>
       </w:pPr>
+      <w:hyperlink r:id="rId6" w:history="1">
+        <w:r>
+          <w:rPr>
+            <w:rStyle w:val="Hyperlink"/>
+            <w:sz w:val="46"/>
+            <w:szCs w:val="46"/>
+          </w:rPr>
+          <w:t>https://www.loom.com/share/273e6b74002348859e360bd1eecfbf6d</w:t>
+        </w:r>
+      </w:hyperlink>
       <w:r>
         <w:rPr>
           <w:sz w:val="46"/>
           <w:szCs w:val="46"/>
         </w:rPr>
-        <w:t>[Video Link]</w:t>
-      </w:r>
-    </w:p>
-    <w:p>
-      <w:pPr>
-        <w:jc w:val="center"/>
-        <w:rPr>
-          <w:sz w:val="46"/>
-          <w:szCs w:val="46"/>
-        </w:rPr>
-      </w:pPr>
+        <w:t xml:space="preserve"> </w:t>
+      </w:r>
     </w:p>
     <w:p/>
     <w:p/>
@@ -215,7 +223,6 @@
         <w:br w:type="page"/>
       </w:r>
     </w:p>
-    <w:p/>
     <w:p>
       <w:pPr>
         <w:jc w:val="center"/>
@@ -231,12 +238,23 @@
           <w:sz w:val="28"/>
           <w:szCs w:val="28"/>
         </w:rPr>
+        <w:lastRenderedPageBreak/>
         <w:t>Part 1</w:t>
       </w:r>
-    </w:p>
-    <w:p>
-      <w:pPr>
-        <w:rPr>
+      <w:r>
+        <w:rPr>
+          <w:b/>
+          <w:sz w:val="28"/>
+          <w:szCs w:val="28"/>
+        </w:rPr>
+        <w:t xml:space="preserve"> Activity Submission</w:t>
+      </w:r>
+    </w:p>
+    <w:p>
+      <w:pPr>
+        <w:rPr>
+          <w:sz w:val="16"/>
+          <w:szCs w:val="16"/>
           <w:lang w:val="en-US"/>
         </w:rPr>
       </w:pPr>
@@ -260,36 +278,34 @@
     <w:p>
       <w:pPr>
         <w:jc w:val="center"/>
-        <w:rPr>
-          <w:sz w:val="28"/>
-          <w:szCs w:val="28"/>
-        </w:rPr>
-      </w:pPr>
-    </w:p>
-    <w:p>
-      <w:pPr>
-        <w:jc w:val="center"/>
       </w:pPr>
       <w:r>
         <w:rPr>
           <w:noProof/>
         </w:rPr>
         <w:drawing>
-          <wp:inline distT="114300" distB="114300" distL="114300" distR="114300" wp14:anchorId="6B917D24" wp14:editId="477ABEFF">
-            <wp:extent cx="3148013" cy="1796373"/>
-            <wp:effectExtent l="0" t="0" r="0" b="0"/>
+          <wp:inline distT="114300" distB="114300" distL="114300" distR="114300" wp14:anchorId="6B917D24" wp14:editId="2CC16DFA">
+            <wp:extent cx="2569464" cy="7315200"/>
+            <wp:effectExtent l="0" t="0" r="2540" b="0"/>
             <wp:docPr id="1" name="image1.jpg"/>
-            <wp:cNvGraphicFramePr/>
+            <wp:cNvGraphicFramePr>
+              <a:graphicFrameLocks xmlns:a="http://schemas.openxmlformats.org/drawingml/2006/main" noChangeAspect="1"/>
+            </wp:cNvGraphicFramePr>
             <a:graphic xmlns:a="http://schemas.openxmlformats.org/drawingml/2006/main">
               <a:graphicData uri="http://schemas.openxmlformats.org/drawingml/2006/picture">
                 <pic:pic xmlns:pic="http://schemas.openxmlformats.org/drawingml/2006/picture">
                   <pic:nvPicPr>
-                    <pic:cNvPr id="0" name="image1.jpg"/>
-                    <pic:cNvPicPr preferRelativeResize="0"/>
+                    <pic:cNvPr id="1" name="image1.jpg"/>
+                    <pic:cNvPicPr/>
                   </pic:nvPicPr>
                   <pic:blipFill>
-                    <a:blip r:embed="rId6"/>
-                    <a:srcRect/>
+                    <a:blip r:embed="rId7">
+                      <a:extLst>
+                        <a:ext uri="{28A0092B-C50C-407E-A947-70E740481C1C}">
+                          <a14:useLocalDpi xmlns:a14="http://schemas.microsoft.com/office/drawing/2010/main" val="0"/>
+                        </a:ext>
+                      </a:extLst>
+                    </a:blip>
                     <a:stretch>
                       <a:fillRect/>
                     </a:stretch>
@@ -297,7 +313,7 @@
                   <pic:spPr>
                     <a:xfrm>
                       <a:off x="0" y="0"/>
-                      <a:ext cx="3148013" cy="1796373"/>
+                      <a:ext cx="2569464" cy="7315200"/>
                     </a:xfrm>
                     <a:prstGeom prst="rect">
                       <a:avLst/>
@@ -316,28 +332,23 @@
         <w:jc w:val="center"/>
       </w:pPr>
       <w:r>
-        <w:t>Figure X: Flow chart of XXXXXXX</w:t>
-      </w:r>
-    </w:p>
-    <w:p>
-      <w:pPr>
-        <w:jc w:val="center"/>
-      </w:pPr>
-    </w:p>
-    <w:p>
-      <w:r>
-        <w:rPr>
-          <w:lang w:val="en-US"/>
-        </w:rPr>
-        <w:t>"Lorem ipsum dolor sit amet, consectetur adipiscing elit, sed do eiusmod tempor incididunt ut labore et dolore magna aliqua. Ut enim ad minim veniam, quis nostrud exercitation ullamco laboris nisi ut aliquip ex ea commodo consequat. Duis aute irure dolor in reprehenderit in voluptate velit esse cillum dolore eu fugiat nulla pariatur. Excepteur sint occaecat cupidatat non proident, sunt in culpa qui officia deserunt mollit anim id est laborum."</w:t>
-      </w:r>
-    </w:p>
-    <w:p>
-      <w:r>
-        <w:br w:type="page"/>
+        <w:t xml:space="preserve">Figure </w:t>
+      </w:r>
+      <w:r>
+        <w:t>1</w:t>
+      </w:r>
+      <w:r>
+        <w:t xml:space="preserve">: Flow chart of </w:t>
+      </w:r>
+      <w:r>
+        <w:t>Activity</w:t>
+      </w:r>
+      <w:r>
+        <w:t xml:space="preserve"> 4</w:t>
       </w:r>
     </w:p>
     <w:p/>
+    <w:p/>
     <w:p>
       <w:pPr>
         <w:jc w:val="center"/>
@@ -372,21 +383,28 @@
           <w:noProof/>
         </w:rPr>
         <w:drawing>
-          <wp:inline distT="114300" distB="114300" distL="114300" distR="114300" wp14:anchorId="4AFE0C49" wp14:editId="0F2A2995">
-            <wp:extent cx="3148013" cy="1796373"/>
+          <wp:inline distT="114300" distB="114300" distL="114300" distR="114300" wp14:anchorId="4AFE0C49" wp14:editId="006C39A3">
+            <wp:extent cx="5943600" cy="5925312"/>
             <wp:effectExtent l="0" t="0" r="0" b="0"/>
             <wp:docPr id="6" name="image1.jpg"/>
-            <wp:cNvGraphicFramePr/>
+            <wp:cNvGraphicFramePr>
+              <a:graphicFrameLocks xmlns:a="http://schemas.openxmlformats.org/drawingml/2006/main" noChangeAspect="1"/>
+            </wp:cNvGraphicFramePr>
             <a:graphic xmlns:a="http://schemas.openxmlformats.org/drawingml/2006/main">
               <a:graphicData uri="http://schemas.openxmlformats.org/drawingml/2006/picture">
                 <pic:pic xmlns:pic="http://schemas.openxmlformats.org/drawingml/2006/picture">
                   <pic:nvPicPr>
-                    <pic:cNvPr id="0" name="image1.jpg"/>
-                    <pic:cNvPicPr preferRelativeResize="0"/>
+                    <pic:cNvPr id="6" name="image1.jpg"/>
+                    <pic:cNvPicPr/>
                   </pic:nvPicPr>
                   <pic:blipFill>
-                    <a:blip r:embed="rId6"/>
-                    <a:srcRect/>
+                    <a:blip r:embed="rId8">
+                      <a:extLst>
+                        <a:ext uri="{28A0092B-C50C-407E-A947-70E740481C1C}">
+                          <a14:useLocalDpi xmlns:a14="http://schemas.microsoft.com/office/drawing/2010/main" val="0"/>
+                        </a:ext>
+                      </a:extLst>
+                    </a:blip>
                     <a:stretch>
                       <a:fillRect/>
                     </a:stretch>
@@ -394,7 +412,7 @@
                   <pic:spPr>
                     <a:xfrm>
                       <a:off x="0" y="0"/>
-                      <a:ext cx="3148013" cy="1796373"/>
+                      <a:ext cx="5943600" cy="5925312"/>
                     </a:xfrm>
                     <a:prstGeom prst="rect">
                       <a:avLst/>
@@ -413,7 +431,25 @@
         <w:jc w:val="center"/>
       </w:pPr>
       <w:r>
-        <w:t>Figure X: UML Class Diagram</w:t>
+        <w:t xml:space="preserve">Figure </w:t>
+      </w:r>
+      <w:r>
+        <w:t>2</w:t>
+      </w:r>
+      <w:r>
+        <w:t xml:space="preserve">: </w:t>
+      </w:r>
+      <w:r>
+        <w:t xml:space="preserve">Final </w:t>
+      </w:r>
+      <w:r>
+        <w:t>UML Class Diagram</w:t>
+      </w:r>
+      <w:r>
+        <w:t xml:space="preserve"> for the Activity 4 project</w:t>
+      </w:r>
+      <w:r>
+        <w:t>.</w:t>
       </w:r>
     </w:p>
     <w:p>
@@ -426,19 +462,7 @@
         <w:rPr>
           <w:lang w:val="en-US"/>
         </w:rPr>
-        <w:t xml:space="preserve">Lorem ipsum dolor sit amet, consectetur adipiscing elit, sed do eiusmod tempor incididunt ut labore et dolore magna aliqua. </w:t>
-      </w:r>
-      <w:r>
-        <w:rPr>
-          <w:lang w:val="pt-BR"/>
-        </w:rPr>
-        <w:t xml:space="preserve">Ut enim ad minim veniam, quis nostrud exercitation ullamco laboris nisi ut aliquip ex ea commodo consequat. </w:t>
-      </w:r>
-      <w:r>
-        <w:rPr>
-          <w:lang w:val="en-US"/>
-        </w:rPr>
-        <w:t>Duis aute irure dolor in reprehenderit in voluptate velit esse cillum dolore eu fugiat nulla pariatur. Excepteur sint occaecat cupidatat non proident, sunt in culpa qui officia deserunt mollit anim id est laborum.</w:t>
+        <w:t>.</w:t>
       </w:r>
     </w:p>
     <w:p>
@@ -464,6 +488,20 @@
         </w:rPr>
         <w:lastRenderedPageBreak/>
         <w:t>Screen Shots</w:t>
+      </w:r>
+      <w:r>
+        <w:rPr>
+          <w:sz w:val="28"/>
+          <w:szCs w:val="28"/>
+        </w:rPr>
+        <w:t xml:space="preserve"> Se</w:t>
+      </w:r>
+      <w:r>
+        <w:rPr>
+          <w:sz w:val="28"/>
+          <w:szCs w:val="28"/>
+        </w:rPr>
+        <w:t>ction 1</w:t>
       </w:r>
     </w:p>
     <w:p>
@@ -499,7 +537,7 @@
                     <pic:cNvPicPr/>
                   </pic:nvPicPr>
                   <pic:blipFill>
-                    <a:blip r:embed="rId7">
+                    <a:blip r:embed="rId9">
                       <a:extLst>
                         <a:ext uri="{28A0092B-C50C-407E-A947-70E740481C1C}">
                           <a14:useLocalDpi xmlns:a14="http://schemas.microsoft.com/office/drawing/2010/main" val="0"/>
@@ -550,7 +588,13 @@
         <w:t xml:space="preserve"> for the first time</w:t>
       </w:r>
       <w:r>
-        <w:t xml:space="preserve"> after completing part one</w:t>
+        <w:t xml:space="preserve"> after completing </w:t>
+      </w:r>
+      <w:r>
+        <w:t>section</w:t>
+      </w:r>
+      <w:r>
+        <w:t xml:space="preserve"> one</w:t>
       </w:r>
       <w:r>
         <w:t>.</w:t>
@@ -564,53 +608,24 @@
       <w:pPr>
         <w:jc w:val="center"/>
         <w:rPr>
-          <w:b/>
-          <w:sz w:val="28"/>
-          <w:szCs w:val="28"/>
-        </w:rPr>
-      </w:pPr>
-      <w:r>
-        <w:rPr>
-          <w:b/>
+          <w:sz w:val="28"/>
+          <w:szCs w:val="28"/>
+        </w:rPr>
+      </w:pPr>
+      <w:r>
+        <w:rPr>
           <w:sz w:val="28"/>
           <w:szCs w:val="28"/>
         </w:rPr>
         <w:lastRenderedPageBreak/>
-        <w:t xml:space="preserve">Part </w:t>
-      </w:r>
-      <w:r>
-        <w:rPr>
-          <w:b/>
+        <w:t xml:space="preserve">Screen Shots Section </w:t>
+      </w:r>
+      <w:r>
+        <w:rPr>
           <w:sz w:val="28"/>
           <w:szCs w:val="28"/>
         </w:rPr>
         <w:t>2</w:t>
-      </w:r>
-    </w:p>
-    <w:p>
-      <w:pPr>
-        <w:jc w:val="center"/>
-        <w:rPr>
-          <w:b/>
-          <w:sz w:val="28"/>
-          <w:szCs w:val="28"/>
-        </w:rPr>
-      </w:pPr>
-    </w:p>
-    <w:p>
-      <w:pPr>
-        <w:jc w:val="center"/>
-        <w:rPr>
-          <w:sz w:val="28"/>
-          <w:szCs w:val="28"/>
-        </w:rPr>
-      </w:pPr>
-      <w:r>
-        <w:rPr>
-          <w:sz w:val="28"/>
-          <w:szCs w:val="28"/>
-        </w:rPr>
-        <w:t>Screen Shots</w:t>
       </w:r>
     </w:p>
     <w:p>
@@ -646,7 +661,7 @@
                     <pic:cNvPicPr/>
                   </pic:nvPicPr>
                   <pic:blipFill>
-                    <a:blip r:embed="rId8">
+                    <a:blip r:embed="rId10">
                       <a:extLst>
                         <a:ext uri="{28A0092B-C50C-407E-A947-70E740481C1C}">
                           <a14:useLocalDpi xmlns:a14="http://schemas.microsoft.com/office/drawing/2010/main" val="0"/>
@@ -697,6 +712,9 @@
         <w:t>UI</w:t>
       </w:r>
       <w:r>
+        <w:t xml:space="preserve"> in section 2</w:t>
+      </w:r>
+      <w:r>
         <w:t>.</w:t>
       </w:r>
     </w:p>
@@ -727,7 +745,7 @@
                     <pic:cNvPicPr/>
                   </pic:nvPicPr>
                   <pic:blipFill>
-                    <a:blip r:embed="rId9" cstate="print">
+                    <a:blip r:embed="rId11" cstate="print">
                       <a:extLst>
                         <a:ext uri="{28A0092B-C50C-407E-A947-70E740481C1C}">
                           <a14:useLocalDpi xmlns:a14="http://schemas.microsoft.com/office/drawing/2010/main" val="0"/>
@@ -807,7 +825,7 @@
                     <pic:cNvPicPr/>
                   </pic:nvPicPr>
                   <pic:blipFill>
-                    <a:blip r:embed="rId10" cstate="print">
+                    <a:blip r:embed="rId12" cstate="print">
                       <a:extLst>
                         <a:ext uri="{28A0092B-C50C-407E-A947-70E740481C1C}">
                           <a14:useLocalDpi xmlns:a14="http://schemas.microsoft.com/office/drawing/2010/main" val="0"/>
@@ -881,7 +899,7 @@
                     <pic:cNvPicPr/>
                   </pic:nvPicPr>
                   <pic:blipFill>
-                    <a:blip r:embed="rId11" cstate="print">
+                    <a:blip r:embed="rId13" cstate="print">
                       <a:extLst>
                         <a:ext uri="{28A0092B-C50C-407E-A947-70E740481C1C}">
                           <a14:useLocalDpi xmlns:a14="http://schemas.microsoft.com/office/drawing/2010/main" val="0"/>
@@ -979,7 +997,7 @@
                     <pic:cNvPicPr/>
                   </pic:nvPicPr>
                   <pic:blipFill>
-                    <a:blip r:embed="rId12" cstate="print">
+                    <a:blip r:embed="rId14" cstate="print">
                       <a:extLst>
                         <a:ext uri="{28A0092B-C50C-407E-A947-70E740481C1C}">
                           <a14:useLocalDpi xmlns:a14="http://schemas.microsoft.com/office/drawing/2010/main" val="0"/>
@@ -1077,7 +1095,7 @@
                     <pic:cNvPicPr/>
                   </pic:nvPicPr>
                   <pic:blipFill>
-                    <a:blip r:embed="rId13" cstate="print">
+                    <a:blip r:embed="rId15" cstate="print">
                       <a:extLst>
                         <a:ext uri="{28A0092B-C50C-407E-A947-70E740481C1C}">
                           <a14:useLocalDpi xmlns:a14="http://schemas.microsoft.com/office/drawing/2010/main" val="0"/>
@@ -1169,7 +1187,7 @@
                     <pic:cNvPicPr/>
                   </pic:nvPicPr>
                   <pic:blipFill>
-                    <a:blip r:embed="rId14" cstate="print">
+                    <a:blip r:embed="rId16" cstate="print">
                       <a:extLst>
                         <a:ext uri="{28A0092B-C50C-407E-A947-70E740481C1C}">
                           <a14:useLocalDpi xmlns:a14="http://schemas.microsoft.com/office/drawing/2010/main" val="0"/>
@@ -1283,7 +1301,7 @@
                     <pic:cNvPicPr/>
                   </pic:nvPicPr>
                   <pic:blipFill>
-                    <a:blip r:embed="rId15" cstate="print">
+                    <a:blip r:embed="rId17" cstate="print">
                       <a:extLst>
                         <a:ext uri="{28A0092B-C50C-407E-A947-70E740481C1C}">
                           <a14:useLocalDpi xmlns:a14="http://schemas.microsoft.com/office/drawing/2010/main" val="0"/>
@@ -1378,7 +1396,7 @@
                     <pic:cNvPicPr/>
                   </pic:nvPicPr>
                   <pic:blipFill>
-                    <a:blip r:embed="rId16" cstate="print">
+                    <a:blip r:embed="rId18" cstate="print">
                       <a:extLst>
                         <a:ext uri="{28A0092B-C50C-407E-A947-70E740481C1C}">
                           <a14:useLocalDpi xmlns:a14="http://schemas.microsoft.com/office/drawing/2010/main" val="0"/>
@@ -1447,43 +1465,24 @@
       <w:pPr>
         <w:jc w:val="center"/>
         <w:rPr>
-          <w:b/>
-          <w:sz w:val="28"/>
-          <w:szCs w:val="28"/>
-        </w:rPr>
-      </w:pPr>
-      <w:r>
-        <w:rPr>
-          <w:b/>
+          <w:sz w:val="28"/>
+          <w:szCs w:val="28"/>
+        </w:rPr>
+      </w:pPr>
+      <w:r>
+        <w:rPr>
           <w:sz w:val="28"/>
           <w:szCs w:val="28"/>
         </w:rPr>
         <w:lastRenderedPageBreak/>
-        <w:t xml:space="preserve">Part </w:t>
-      </w:r>
-      <w:r>
-        <w:rPr>
-          <w:b/>
+        <w:t xml:space="preserve">Screen Shots Section </w:t>
+      </w:r>
+      <w:r>
+        <w:rPr>
           <w:sz w:val="28"/>
           <w:szCs w:val="28"/>
         </w:rPr>
         <w:t>3</w:t>
-      </w:r>
-    </w:p>
-    <w:p>
-      <w:pPr>
-        <w:jc w:val="center"/>
-        <w:rPr>
-          <w:sz w:val="28"/>
-          <w:szCs w:val="28"/>
-        </w:rPr>
-      </w:pPr>
-      <w:r>
-        <w:rPr>
-          <w:sz w:val="28"/>
-          <w:szCs w:val="28"/>
-        </w:rPr>
-        <w:t>Screen Shots</w:t>
       </w:r>
     </w:p>
     <w:p>
@@ -1519,7 +1518,7 @@
                     <pic:cNvPicPr/>
                   </pic:nvPicPr>
                   <pic:blipFill>
-                    <a:blip r:embed="rId17">
+                    <a:blip r:embed="rId19">
                       <a:extLst>
                         <a:ext uri="{28A0092B-C50C-407E-A947-70E740481C1C}">
                           <a14:useLocalDpi xmlns:a14="http://schemas.microsoft.com/office/drawing/2010/main" val="0"/>
@@ -1575,6 +1574,14 @@
       <w:r>
         <w:t xml:space="preserve"> message box on screen</w:t>
       </w:r>
+      <w:r>
+        <w:t xml:space="preserve"> as per section 3 instructions.</w:t>
+      </w:r>
+    </w:p>
+    <w:p>
+      <w:pPr>
+        <w:jc w:val="center"/>
+      </w:pPr>
     </w:p>
     <w:p/>
     <w:p>
@@ -1601,7 +1608,7 @@
                     <pic:cNvPicPr/>
                   </pic:nvPicPr>
                   <pic:blipFill>
-                    <a:blip r:embed="rId18">
+                    <a:blip r:embed="rId20">
                       <a:extLst>
                         <a:ext uri="{28A0092B-C50C-407E-A947-70E740481C1C}">
                           <a14:useLocalDpi xmlns:a14="http://schemas.microsoft.com/office/drawing/2010/main" val="0"/>
@@ -1634,6 +1641,7 @@
         <w:jc w:val="center"/>
       </w:pPr>
       <w:r>
+        <w:lastRenderedPageBreak/>
         <w:t xml:space="preserve">Figure </w:t>
       </w:r>
       <w:r>
@@ -1680,7 +1688,7 @@
                     <pic:cNvPicPr/>
                   </pic:nvPicPr>
                   <pic:blipFill>
-                    <a:blip r:embed="rId19" cstate="print">
+                    <a:blip r:embed="rId21" cstate="print">
                       <a:extLst>
                         <a:ext uri="{28A0092B-C50C-407E-A947-70E740481C1C}">
                           <a14:useLocalDpi xmlns:a14="http://schemas.microsoft.com/office/drawing/2010/main" val="0"/>
@@ -1728,6 +1736,11 @@
         <w:t xml:space="preserve"> FrmOrderDetails</w:t>
       </w:r>
     </w:p>
+    <w:p>
+      <w:pPr>
+        <w:jc w:val="center"/>
+      </w:pPr>
+    </w:p>
     <w:p/>
     <w:p>
       <w:pPr>
@@ -1753,7 +1766,7 @@
                     <pic:cNvPicPr/>
                   </pic:nvPicPr>
                   <pic:blipFill>
-                    <a:blip r:embed="rId20" cstate="print">
+                    <a:blip r:embed="rId22" cstate="print">
                       <a:extLst>
                         <a:ext uri="{28A0092B-C50C-407E-A947-70E740481C1C}">
                           <a14:useLocalDpi xmlns:a14="http://schemas.microsoft.com/office/drawing/2010/main" val="0"/>
@@ -1786,13 +1799,7 @@
         <w:jc w:val="center"/>
       </w:pPr>
       <w:r>
-        <w:t>Figure 3-</w:t>
-      </w:r>
-      <w:r>
-        <w:t>4</w:t>
-      </w:r>
-      <w:r>
-        <w:t xml:space="preserve">: Screenshot of </w:t>
+        <w:t xml:space="preserve">Figure 3-4: Screenshot of </w:t>
       </w:r>
       <w:r>
         <w:t>Display</w:t>
@@ -1851,7 +1858,7 @@
                     <pic:cNvPicPr/>
                   </pic:nvPicPr>
                   <pic:blipFill>
-                    <a:blip r:embed="rId21" cstate="print">
+                    <a:blip r:embed="rId23" cstate="print">
                       <a:extLst>
                         <a:ext uri="{28A0092B-C50C-407E-A947-70E740481C1C}">
                           <a14:useLocalDpi xmlns:a14="http://schemas.microsoft.com/office/drawing/2010/main" val="0"/>
@@ -1884,17 +1891,16 @@
         <w:jc w:val="center"/>
       </w:pPr>
       <w:r>
-        <w:t>Figure 3-</w:t>
-      </w:r>
-      <w:r>
-        <w:t>5</w:t>
-      </w:r>
-      <w:r>
-        <w:t xml:space="preserve">: Screenshot of </w:t>
+        <w:t xml:space="preserve">Figure 3-5: Screenshot of </w:t>
       </w:r>
       <w:r>
         <w:t>the BtnCreatePizzaClickEH, and BtnSeeFullOrderClickEH methods in FrmPizzaMaker.</w:t>
       </w:r>
+    </w:p>
+    <w:p>
+      <w:pPr>
+        <w:jc w:val="center"/>
+      </w:pPr>
     </w:p>
     <w:p>
       <w:pPr>
@@ -1925,7 +1931,7 @@
                     <pic:cNvPicPr/>
                   </pic:nvPicPr>
                   <pic:blipFill>
-                    <a:blip r:embed="rId22" cstate="print">
+                    <a:blip r:embed="rId24" cstate="print">
                       <a:extLst>
                         <a:ext uri="{28A0092B-C50C-407E-A947-70E740481C1C}">
                           <a14:useLocalDpi xmlns:a14="http://schemas.microsoft.com/office/drawing/2010/main" val="0"/>
@@ -1980,19 +1986,6 @@
       </w:pPr>
       <w:r>
         <w:rPr>
-          <w:b/>
-          <w:sz w:val="28"/>
-          <w:szCs w:val="28"/>
-        </w:rPr>
-        <w:br w:type="page"/>
-      </w:r>
-    </w:p>
-    <w:p>
-      <w:pPr>
-        <w:jc w:val="center"/>
-      </w:pPr>
-      <w:r>
-        <w:rPr>
           <w:noProof/>
         </w:rPr>
         <w:lastRenderedPageBreak/>
@@ -2012,7 +2005,7 @@
                     <pic:cNvPicPr/>
                   </pic:nvPicPr>
                   <pic:blipFill>
-                    <a:blip r:embed="rId23" cstate="print">
+                    <a:blip r:embed="rId25" cstate="print">
                       <a:extLst>
                         <a:ext uri="{28A0092B-C50C-407E-A947-70E740481C1C}">
                           <a14:useLocalDpi xmlns:a14="http://schemas.microsoft.com/office/drawing/2010/main" val="0"/>
@@ -2129,7 +2122,7 @@
                     <pic:cNvPicPr/>
                   </pic:nvPicPr>
                   <pic:blipFill>
-                    <a:blip r:embed="rId24">
+                    <a:blip r:embed="rId26">
                       <a:extLst>
                         <a:ext uri="{28A0092B-C50C-407E-A947-70E740481C1C}">
                           <a14:useLocalDpi xmlns:a14="http://schemas.microsoft.com/office/drawing/2010/main" val="0"/>
@@ -2218,39 +2211,44 @@
           <w:sz w:val="28"/>
           <w:szCs w:val="28"/>
         </w:rPr>
-        <w:t>3</w:t>
-      </w:r>
-    </w:p>
-    <w:p>
-      <w:pPr>
-        <w:rPr>
-          <w:lang w:val="en-US"/>
-        </w:rPr>
-      </w:pPr>
-    </w:p>
-    <w:p>
-      <w:pPr>
-        <w:jc w:val="center"/>
-        <w:rPr>
-          <w:sz w:val="28"/>
-          <w:szCs w:val="28"/>
-        </w:rPr>
-      </w:pPr>
-      <w:r>
-        <w:rPr>
-          <w:sz w:val="28"/>
-          <w:szCs w:val="28"/>
-        </w:rPr>
-        <w:t>FLOW CHART</w:t>
-      </w:r>
-    </w:p>
-    <w:p>
-      <w:pPr>
-        <w:jc w:val="center"/>
-        <w:rPr>
-          <w:sz w:val="28"/>
-          <w:szCs w:val="28"/>
-        </w:rPr>
+        <w:t>2</w:t>
+      </w:r>
+      <w:r>
+        <w:rPr>
+          <w:b/>
+          <w:sz w:val="28"/>
+          <w:szCs w:val="28"/>
+        </w:rPr>
+        <w:t xml:space="preserve"> </w:t>
+      </w:r>
+      <w:r>
+        <w:rPr>
+          <w:b/>
+          <w:sz w:val="28"/>
+          <w:szCs w:val="28"/>
+        </w:rPr>
+        <w:t>Challenges</w:t>
+      </w:r>
+    </w:p>
+    <w:p>
+      <w:pPr>
+        <w:jc w:val="center"/>
+        <w:rPr>
+          <w:sz w:val="28"/>
+          <w:szCs w:val="28"/>
+        </w:rPr>
+      </w:pPr>
+      <w:r>
+        <w:rPr>
+          <w:sz w:val="28"/>
+          <w:szCs w:val="28"/>
+        </w:rPr>
+        <w:t>Screen Shots</w:t>
+      </w:r>
+    </w:p>
+    <w:p>
+      <w:pPr>
+        <w:jc w:val="center"/>
       </w:pPr>
     </w:p>
     <w:p>
@@ -2262,21 +2260,28 @@
           <w:noProof/>
         </w:rPr>
         <w:drawing>
-          <wp:inline distT="114300" distB="114300" distL="114300" distR="114300" wp14:anchorId="5F451F99" wp14:editId="79DA2C96">
-            <wp:extent cx="3148013" cy="1796373"/>
-            <wp:effectExtent l="0" t="0" r="0" b="0"/>
-            <wp:docPr id="905574333" name="image1.jpg"/>
-            <wp:cNvGraphicFramePr/>
+          <wp:inline distT="114300" distB="114300" distL="114300" distR="114300" wp14:anchorId="72B4AC75" wp14:editId="2A6528D8">
+            <wp:extent cx="5943600" cy="6601968"/>
+            <wp:effectExtent l="0" t="0" r="0" b="8890"/>
+            <wp:docPr id="1795773538" name="image1.jpg"/>
+            <wp:cNvGraphicFramePr>
+              <a:graphicFrameLocks xmlns:a="http://schemas.openxmlformats.org/drawingml/2006/main" noChangeAspect="1"/>
+            </wp:cNvGraphicFramePr>
             <a:graphic xmlns:a="http://schemas.openxmlformats.org/drawingml/2006/main">
               <a:graphicData uri="http://schemas.openxmlformats.org/drawingml/2006/picture">
                 <pic:pic xmlns:pic="http://schemas.openxmlformats.org/drawingml/2006/picture">
                   <pic:nvPicPr>
-                    <pic:cNvPr id="0" name="image1.jpg"/>
-                    <pic:cNvPicPr preferRelativeResize="0"/>
+                    <pic:cNvPr id="1795773538" name="image1.jpg"/>
+                    <pic:cNvPicPr/>
                   </pic:nvPicPr>
                   <pic:blipFill>
-                    <a:blip r:embed="rId6"/>
-                    <a:srcRect/>
+                    <a:blip r:embed="rId27" cstate="print">
+                      <a:extLst>
+                        <a:ext uri="{28A0092B-C50C-407E-A947-70E740481C1C}">
+                          <a14:useLocalDpi xmlns:a14="http://schemas.microsoft.com/office/drawing/2010/main" val="0"/>
+                        </a:ext>
+                      </a:extLst>
+                    </a:blip>
                     <a:stretch>
                       <a:fillRect/>
                     </a:stretch>
@@ -2284,7 +2289,7 @@
                   <pic:spPr>
                     <a:xfrm>
                       <a:off x="0" y="0"/>
-                      <a:ext cx="3148013" cy="1796373"/>
+                      <a:ext cx="5943600" cy="6601968"/>
                     </a:xfrm>
                     <a:prstGeom prst="rect">
                       <a:avLst/>
@@ -2303,51 +2308,30 @@
         <w:jc w:val="center"/>
       </w:pPr>
       <w:r>
-        <w:t>Figure X: Flow chart of XXXXXXX</w:t>
-      </w:r>
-    </w:p>
-    <w:p>
-      <w:pPr>
-        <w:jc w:val="center"/>
-      </w:pPr>
-    </w:p>
-    <w:p>
-      <w:r>
-        <w:rPr>
-          <w:lang w:val="en-US"/>
-        </w:rPr>
-        <w:t>"Lorem ipsum dolor sit amet, consectetur adipiscing elit, sed do eiusmod tempor incididunt ut labore et dolore magna aliqua. Ut enim ad minim veniam, quis nostrud exercitation ullamco laboris nisi ut aliquip ex ea commodo consequat. Duis aute irure dolor in reprehenderit in voluptate velit esse cillum dolore eu fugiat nulla pariatur. Excepteur sint occaecat cupidatat non proident, sunt in culpa qui officia deserunt mollit anim id est laborum."</w:t>
-      </w:r>
-    </w:p>
-    <w:p>
-      <w:r>
-        <w:br w:type="page"/>
-      </w:r>
-    </w:p>
-    <w:p/>
-    <w:p>
-      <w:pPr>
-        <w:jc w:val="center"/>
-        <w:rPr>
-          <w:sz w:val="28"/>
-          <w:szCs w:val="28"/>
-        </w:rPr>
-      </w:pPr>
-      <w:r>
-        <w:rPr>
-          <w:sz w:val="28"/>
-          <w:szCs w:val="28"/>
-        </w:rPr>
-        <w:t>UML Class Diagram</w:t>
-      </w:r>
-    </w:p>
-    <w:p>
-      <w:pPr>
-        <w:jc w:val="center"/>
-        <w:rPr>
-          <w:sz w:val="28"/>
-          <w:szCs w:val="28"/>
-        </w:rPr>
+        <w:t xml:space="preserve">Figure </w:t>
+      </w:r>
+      <w:r>
+        <w:t>C-</w:t>
+      </w:r>
+      <w:r>
+        <w:t>1</w:t>
+      </w:r>
+      <w:r>
+        <w:t xml:space="preserve">: Screenshot of </w:t>
+      </w:r>
+      <w:r>
+        <w:t xml:space="preserve">the </w:t>
+      </w:r>
+      <w:r>
+        <w:t>Pizza validation challenge</w:t>
+      </w:r>
+      <w:r>
+        <w:t>. The order fails because there is no name and there is no cheese.</w:t>
+      </w:r>
+    </w:p>
+    <w:p>
+      <w:pPr>
+        <w:jc w:val="center"/>
       </w:pPr>
     </w:p>
     <w:p>
@@ -2358,22 +2342,30 @@
         <w:rPr>
           <w:noProof/>
         </w:rPr>
+        <w:lastRenderedPageBreak/>
         <w:drawing>
-          <wp:inline distT="114300" distB="114300" distL="114300" distR="114300" wp14:anchorId="41ED67EF" wp14:editId="4BB915F6">
-            <wp:extent cx="3148013" cy="1796373"/>
+          <wp:inline distT="114300" distB="114300" distL="114300" distR="114300" wp14:anchorId="513B8830" wp14:editId="05DCB872">
+            <wp:extent cx="5943600" cy="6611112"/>
             <wp:effectExtent l="0" t="0" r="0" b="0"/>
-            <wp:docPr id="1955513105" name="image1.jpg"/>
-            <wp:cNvGraphicFramePr/>
+            <wp:docPr id="968731384" name="image1.jpg"/>
+            <wp:cNvGraphicFramePr>
+              <a:graphicFrameLocks xmlns:a="http://schemas.openxmlformats.org/drawingml/2006/main" noChangeAspect="1"/>
+            </wp:cNvGraphicFramePr>
             <a:graphic xmlns:a="http://schemas.openxmlformats.org/drawingml/2006/main">
               <a:graphicData uri="http://schemas.openxmlformats.org/drawingml/2006/picture">
                 <pic:pic xmlns:pic="http://schemas.openxmlformats.org/drawingml/2006/picture">
                   <pic:nvPicPr>
-                    <pic:cNvPr id="0" name="image1.jpg"/>
-                    <pic:cNvPicPr preferRelativeResize="0"/>
+                    <pic:cNvPr id="968731384" name="image1.jpg"/>
+                    <pic:cNvPicPr/>
                   </pic:nvPicPr>
                   <pic:blipFill>
-                    <a:blip r:embed="rId6"/>
-                    <a:srcRect/>
+                    <a:blip r:embed="rId28">
+                      <a:extLst>
+                        <a:ext uri="{28A0092B-C50C-407E-A947-70E740481C1C}">
+                          <a14:useLocalDpi xmlns:a14="http://schemas.microsoft.com/office/drawing/2010/main" val="0"/>
+                        </a:ext>
+                      </a:extLst>
+                    </a:blip>
                     <a:stretch>
                       <a:fillRect/>
                     </a:stretch>
@@ -2381,7 +2373,7 @@
                   <pic:spPr>
                     <a:xfrm>
                       <a:off x="0" y="0"/>
-                      <a:ext cx="3148013" cy="1796373"/>
+                      <a:ext cx="5943600" cy="6611112"/>
                     </a:xfrm>
                     <a:prstGeom prst="rect">
                       <a:avLst/>
@@ -2400,92 +2392,67 @@
         <w:jc w:val="center"/>
       </w:pPr>
       <w:r>
-        <w:t>Figure X: UML Class Diagram</w:t>
-      </w:r>
-    </w:p>
-    <w:p>
-      <w:pPr>
-        <w:jc w:val="center"/>
-      </w:pPr>
-    </w:p>
-    <w:p>
-      <w:r>
-        <w:rPr>
-          <w:lang w:val="en-US"/>
-        </w:rPr>
-        <w:t xml:space="preserve">Lorem ipsum dolor sit amet, consectetur adipiscing elit, sed do eiusmod tempor incididunt ut labore et dolore magna aliqua. </w:t>
-      </w:r>
-      <w:r>
-        <w:rPr>
-          <w:lang w:val="pt-BR"/>
-        </w:rPr>
-        <w:t xml:space="preserve">Ut enim ad minim veniam, quis nostrud exercitation ullamco laboris nisi ut aliquip ex ea commodo consequat. </w:t>
-      </w:r>
-      <w:r>
-        <w:rPr>
-          <w:lang w:val="en-US"/>
-        </w:rPr>
-        <w:t>Duis aute irure dolor in reprehenderit in voluptate velit esse cillum dolore eu fugiat nulla pariatur. Excepteur sint occaecat cupidatat non proident, sunt in culpa qui officia deserunt mollit anim id est laborum.</w:t>
-      </w:r>
-    </w:p>
-    <w:p>
-      <w:pPr>
-        <w:jc w:val="center"/>
-      </w:pPr>
-      <w:r>
-        <w:br w:type="page"/>
-      </w:r>
-    </w:p>
-    <w:p>
-      <w:pPr>
-        <w:jc w:val="center"/>
-        <w:rPr>
-          <w:sz w:val="28"/>
-          <w:szCs w:val="28"/>
-        </w:rPr>
-      </w:pPr>
-      <w:r>
-        <w:rPr>
-          <w:sz w:val="28"/>
-          <w:szCs w:val="28"/>
+        <w:t xml:space="preserve">Figure </w:t>
+      </w:r>
+      <w:r>
+        <w:t>C-2</w:t>
+      </w:r>
+      <w:r>
+        <w:t xml:space="preserve">: Screenshot of </w:t>
+      </w:r>
+      <w:r>
+        <w:t xml:space="preserve">the </w:t>
+      </w:r>
+      <w:r>
+        <w:t xml:space="preserve">app after </w:t>
+      </w:r>
+      <w:r>
+        <w:t xml:space="preserve">fixing the missing data in figure C-1 and </w:t>
+      </w:r>
+      <w:r>
+        <w:t>successfully adding a pizza to the order</w:t>
+      </w:r>
+      <w:r>
+        <w:t>. The order info values get populated in that group box.</w:t>
+      </w:r>
+    </w:p>
+    <w:p>
+      <w:pPr>
+        <w:jc w:val="center"/>
+      </w:pPr>
+    </w:p>
+    <w:p>
+      <w:pPr>
+        <w:jc w:val="center"/>
+      </w:pPr>
+      <w:r>
+        <w:rPr>
+          <w:noProof/>
         </w:rPr>
         <w:lastRenderedPageBreak/>
-        <w:t>Screen Shots</w:t>
-      </w:r>
-    </w:p>
-    <w:p>
-      <w:pPr>
-        <w:jc w:val="center"/>
-        <w:rPr>
-          <w:sz w:val="28"/>
-          <w:szCs w:val="28"/>
-        </w:rPr>
-      </w:pPr>
-    </w:p>
-    <w:p>
-      <w:pPr>
-        <w:jc w:val="center"/>
-      </w:pPr>
-      <w:r>
-        <w:rPr>
-          <w:noProof/>
-        </w:rPr>
         <w:drawing>
-          <wp:inline distT="114300" distB="114300" distL="114300" distR="114300" wp14:anchorId="168C6BEA" wp14:editId="2414B8EA">
-            <wp:extent cx="3148013" cy="1796373"/>
-            <wp:effectExtent l="0" t="0" r="0" b="0"/>
-            <wp:docPr id="1132534699" name="image1.jpg"/>
-            <wp:cNvGraphicFramePr/>
+          <wp:inline distT="114300" distB="114300" distL="114300" distR="114300" wp14:anchorId="59FC2EE8" wp14:editId="7A43ABB2">
+            <wp:extent cx="5943600" cy="4297680"/>
+            <wp:effectExtent l="0" t="0" r="0" b="7620"/>
+            <wp:docPr id="1702633779" name="image1.jpg"/>
+            <wp:cNvGraphicFramePr>
+              <a:graphicFrameLocks xmlns:a="http://schemas.openxmlformats.org/drawingml/2006/main" noChangeAspect="1"/>
+            </wp:cNvGraphicFramePr>
             <a:graphic xmlns:a="http://schemas.openxmlformats.org/drawingml/2006/main">
               <a:graphicData uri="http://schemas.openxmlformats.org/drawingml/2006/picture">
                 <pic:pic xmlns:pic="http://schemas.openxmlformats.org/drawingml/2006/picture">
                   <pic:nvPicPr>
-                    <pic:cNvPr id="0" name="image1.jpg"/>
-                    <pic:cNvPicPr preferRelativeResize="0"/>
+                    <pic:cNvPr id="1702633779" name="image1.jpg"/>
+                    <pic:cNvPicPr/>
                   </pic:nvPicPr>
                   <pic:blipFill>
-                    <a:blip r:embed="rId6"/>
-                    <a:srcRect/>
+                    <a:blip r:embed="rId29">
+                      <a:extLst>
+                        <a:ext uri="{28A0092B-C50C-407E-A947-70E740481C1C}">
+                          <a14:useLocalDpi xmlns:a14="http://schemas.microsoft.com/office/drawing/2010/main" val="0"/>
+                        </a:ext>
+                      </a:extLst>
+                    </a:blip>
                     <a:stretch>
                       <a:fillRect/>
                     </a:stretch>
@@ -2493,7 +2460,7 @@
                   <pic:spPr>
                     <a:xfrm>
                       <a:off x="0" y="0"/>
-                      <a:ext cx="3148013" cy="1796373"/>
+                      <a:ext cx="5943600" cy="4297680"/>
                     </a:xfrm>
                     <a:prstGeom prst="rect">
                       <a:avLst/>
@@ -2512,54 +2479,24 @@
         <w:jc w:val="center"/>
       </w:pPr>
       <w:r>
-        <w:t xml:space="preserve">Figure X: Part </w:t>
-      </w:r>
-      <w:r>
-        <w:t>3</w:t>
-      </w:r>
-      <w:r>
-        <w:t xml:space="preserve"> App Running</w:t>
-      </w:r>
-    </w:p>
-    <w:p>
-      <w:pPr>
-        <w:jc w:val="center"/>
-      </w:pPr>
-    </w:p>
-    <w:p>
-      <w:pPr>
-        <w:rPr>
-          <w:lang w:val="en-US"/>
-        </w:rPr>
-      </w:pPr>
-      <w:r>
-        <w:rPr>
-          <w:lang w:val="en-US"/>
-        </w:rPr>
-        <w:t xml:space="preserve">Lorem ipsum dolor sit amet, consectetur adipiscing elit, sed do eiusmod tempor incididunt ut labore et dolore magna aliqua. </w:t>
-      </w:r>
-      <w:r>
-        <w:rPr>
-          <w:lang w:val="pt-BR"/>
-        </w:rPr>
-        <w:t xml:space="preserve">Ut enim ad minim veniam, quis nostrud exercitation ullamco laboris nisi ut aliquip ex ea commodo consequat. </w:t>
-      </w:r>
-      <w:r>
-        <w:rPr>
-          <w:lang w:val="en-US"/>
-        </w:rPr>
-        <w:t>Duis aute irure dolor in reprehenderit in voluptate velit esse cillum dolore eu fugiat nulla pariatur. Excepteur sint occaecat cupidatat non proident, sunt in culpa qui officia deserunt mollit anim id est laborum.</w:t>
-      </w:r>
-    </w:p>
-    <w:p/>
-    <w:p/>
-    <w:p>
-      <w:pPr>
-        <w:jc w:val="center"/>
-        <w:rPr>
-          <w:sz w:val="28"/>
-          <w:szCs w:val="28"/>
-        </w:rPr>
+        <w:t xml:space="preserve">Figure </w:t>
+      </w:r>
+      <w:r>
+        <w:t>C-3</w:t>
+      </w:r>
+      <w:r>
+        <w:t xml:space="preserve">: Screenshot of </w:t>
+      </w:r>
+      <w:r>
+        <w:t xml:space="preserve">the </w:t>
+      </w:r>
+      <w:r>
+        <w:t>order when the see full order button in Figure C-2 is pressed.</w:t>
+      </w:r>
+    </w:p>
+    <w:p>
+      <w:pPr>
+        <w:jc w:val="center"/>
       </w:pPr>
     </w:p>
     <w:p>
@@ -2570,22 +2507,30 @@
         <w:rPr>
           <w:noProof/>
         </w:rPr>
+        <w:lastRenderedPageBreak/>
         <w:drawing>
-          <wp:inline distT="114300" distB="114300" distL="114300" distR="114300" wp14:anchorId="4A06B8BB" wp14:editId="7EE9C1F6">
-            <wp:extent cx="3148013" cy="1796373"/>
-            <wp:effectExtent l="0" t="0" r="0" b="0"/>
-            <wp:docPr id="1684668719" name="image1.jpg"/>
-            <wp:cNvGraphicFramePr/>
+          <wp:inline distT="114300" distB="114300" distL="114300" distR="114300" wp14:anchorId="10E76385" wp14:editId="111EC74D">
+            <wp:extent cx="5943600" cy="6647688"/>
+            <wp:effectExtent l="0" t="0" r="0" b="1270"/>
+            <wp:docPr id="1394084145" name="image1.jpg"/>
+            <wp:cNvGraphicFramePr>
+              <a:graphicFrameLocks xmlns:a="http://schemas.openxmlformats.org/drawingml/2006/main" noChangeAspect="1"/>
+            </wp:cNvGraphicFramePr>
             <a:graphic xmlns:a="http://schemas.openxmlformats.org/drawingml/2006/main">
               <a:graphicData uri="http://schemas.openxmlformats.org/drawingml/2006/picture">
                 <pic:pic xmlns:pic="http://schemas.openxmlformats.org/drawingml/2006/picture">
                   <pic:nvPicPr>
-                    <pic:cNvPr id="0" name="image1.jpg"/>
-                    <pic:cNvPicPr preferRelativeResize="0"/>
+                    <pic:cNvPr id="1702633779" name="image1.jpg"/>
+                    <pic:cNvPicPr/>
                   </pic:nvPicPr>
                   <pic:blipFill>
-                    <a:blip r:embed="rId6"/>
-                    <a:srcRect/>
+                    <a:blip r:embed="rId30" cstate="print">
+                      <a:extLst>
+                        <a:ext uri="{28A0092B-C50C-407E-A947-70E740481C1C}">
+                          <a14:useLocalDpi xmlns:a14="http://schemas.microsoft.com/office/drawing/2010/main" val="0"/>
+                        </a:ext>
+                      </a:extLst>
+                    </a:blip>
                     <a:stretch>
                       <a:fillRect/>
                     </a:stretch>
@@ -2593,7 +2538,7 @@
                   <pic:spPr>
                     <a:xfrm>
                       <a:off x="0" y="0"/>
-                      <a:ext cx="3148013" cy="1796373"/>
+                      <a:ext cx="5943600" cy="6647688"/>
                     </a:xfrm>
                     <a:prstGeom prst="rect">
                       <a:avLst/>
@@ -2612,24 +2557,80 @@
         <w:jc w:val="center"/>
       </w:pPr>
       <w:r>
-        <w:t>Figure X: Screenshot of successful output</w:t>
-      </w:r>
-    </w:p>
-    <w:p>
-      <w:pPr>
-        <w:jc w:val="center"/>
-      </w:pPr>
-    </w:p>
-    <w:p>
-      <w:r>
-        <w:rPr>
-          <w:lang w:val="en-US"/>
-        </w:rPr>
-        <w:t>Lorem ipsum dolor sit amet, consectetur adipiscing elit, sed do eiusmod tempor incididunt ut labore et dolore magna aliqua. Ut enim ad minim veniam, quis nostrud exercitation ullamco laboris nisi ut aliquip ex ea commodo consequat. Duis aute irure dolor in reprehenderit in voluptate velit esse cillum dolore eu fugiat nulla pariatur. Excepteur sint occaecat cupidatat non proident, sunt in culpa qui officia deserunt mollit anim id est laborum.</w:t>
-      </w:r>
-    </w:p>
-    <w:p/>
-    <w:p/>
+        <w:t xml:space="preserve">Figure </w:t>
+      </w:r>
+      <w:r>
+        <w:t>C-4</w:t>
+      </w:r>
+      <w:r>
+        <w:t xml:space="preserve">: Screenshot of </w:t>
+      </w:r>
+      <w:r>
+        <w:t xml:space="preserve">the </w:t>
+      </w:r>
+      <w:r>
+        <w:t>app after canceling the full order window by pressing the cancel button shown in Figure C-3</w:t>
+      </w:r>
+      <w:r>
+        <w:t xml:space="preserve"> and then pressing the checkout button.</w:t>
+      </w:r>
+      <w:r>
+        <w:t xml:space="preserve"> The app is fully operational and robust and can easily pass over all the </w:t>
+      </w:r>
+      <w:r>
+        <w:t xml:space="preserve">order </w:t>
+      </w:r>
+      <w:r>
+        <w:t xml:space="preserve">data to </w:t>
+      </w:r>
+      <w:r>
+        <w:t>the</w:t>
+      </w:r>
+      <w:r>
+        <w:t xml:space="preserve"> checkout</w:t>
+      </w:r>
+      <w:r>
+        <w:t xml:space="preserve"> backend</w:t>
+      </w:r>
+      <w:r>
+        <w:t xml:space="preserve"> </w:t>
+      </w:r>
+      <w:r>
+        <w:t>in the future instead of simply displaying a messag</w:t>
+      </w:r>
+      <w:r>
+        <w:t xml:space="preserve">e </w:t>
+      </w:r>
+      <w:r>
+        <w:t>box</w:t>
+      </w:r>
+      <w:r>
+        <w:t>.</w:t>
+      </w:r>
+    </w:p>
+    <w:p>
+      <w:pPr>
+        <w:rPr>
+          <w:b/>
+          <w:sz w:val="28"/>
+          <w:szCs w:val="28"/>
+        </w:rPr>
+      </w:pPr>
+    </w:p>
+    <w:p>
+      <w:pPr>
+        <w:rPr>
+          <w:b/>
+          <w:sz w:val="28"/>
+          <w:szCs w:val="28"/>
+        </w:rPr>
+      </w:pPr>
+    </w:p>
+    <w:p>
+      <w:pPr>
+        <w:jc w:val="center"/>
+      </w:pPr>
+    </w:p>
     <w:p>
       <w:pPr>
         <w:jc w:val="center"/>
@@ -2640,21 +2641,28 @@
         </w:rPr>
         <w:lastRenderedPageBreak/>
         <w:drawing>
-          <wp:inline distT="114300" distB="114300" distL="114300" distR="114300" wp14:anchorId="68C2E703" wp14:editId="1825469E">
-            <wp:extent cx="3148013" cy="1796373"/>
+          <wp:inline distT="114300" distB="114300" distL="114300" distR="114300" wp14:anchorId="364E1863" wp14:editId="73CE79D5">
+            <wp:extent cx="5944125" cy="2084832"/>
             <wp:effectExtent l="0" t="0" r="0" b="0"/>
-            <wp:docPr id="1536500323" name="image1.jpg"/>
-            <wp:cNvGraphicFramePr/>
+            <wp:docPr id="1081291901" name="image1.jpg"/>
+            <wp:cNvGraphicFramePr>
+              <a:graphicFrameLocks xmlns:a="http://schemas.openxmlformats.org/drawingml/2006/main" noChangeAspect="1"/>
+            </wp:cNvGraphicFramePr>
             <a:graphic xmlns:a="http://schemas.openxmlformats.org/drawingml/2006/main">
               <a:graphicData uri="http://schemas.openxmlformats.org/drawingml/2006/picture">
                 <pic:pic xmlns:pic="http://schemas.openxmlformats.org/drawingml/2006/picture">
                   <pic:nvPicPr>
-                    <pic:cNvPr id="0" name="image1.jpg"/>
-                    <pic:cNvPicPr preferRelativeResize="0"/>
+                    <pic:cNvPr id="1081291901" name="image1.jpg"/>
+                    <pic:cNvPicPr/>
                   </pic:nvPicPr>
                   <pic:blipFill>
-                    <a:blip r:embed="rId6"/>
-                    <a:srcRect/>
+                    <a:blip r:embed="rId31" cstate="print">
+                      <a:extLst>
+                        <a:ext uri="{28A0092B-C50C-407E-A947-70E740481C1C}">
+                          <a14:useLocalDpi xmlns:a14="http://schemas.microsoft.com/office/drawing/2010/main" val="0"/>
+                        </a:ext>
+                      </a:extLst>
+                    </a:blip>
                     <a:stretch>
                       <a:fillRect/>
                     </a:stretch>
@@ -2662,7 +2670,7 @@
                   <pic:spPr>
                     <a:xfrm>
                       <a:off x="0" y="0"/>
-                      <a:ext cx="3148013" cy="1796373"/>
+                      <a:ext cx="5944125" cy="2084832"/>
                     </a:xfrm>
                     <a:prstGeom prst="rect">
                       <a:avLst/>
@@ -2681,78 +2689,27 @@
         <w:jc w:val="center"/>
       </w:pPr>
       <w:r>
-        <w:t>Figure X: Screenshot of Error Handling</w:t>
-      </w:r>
-    </w:p>
-    <w:p>
-      <w:pPr>
-        <w:jc w:val="center"/>
-      </w:pPr>
-    </w:p>
-    <w:p>
-      <w:r>
-        <w:rPr>
-          <w:lang w:val="en-US"/>
-        </w:rPr>
-        <w:t>Lorem ipsum dolor sit amet, consectetur adipiscing elit, sed do eiusmod tempor incididunt ut labore et dolore magna aliqua. Ut enim ad minim veniam, quis nostrud exercitation ullamco laboris nisi ut aliquip ex ea commodo consequat. Duis aute irure dolor in reprehenderit in voluptate velit esse cillum dolore eu fugiat nulla pariatur. Excepteur sint occaecat cupidatat non proident, sunt in culpa qui officia deserunt mollit anim id est laborum.</w:t>
-      </w:r>
-    </w:p>
-    <w:p/>
-    <w:p/>
-    <w:p>
-      <w:r>
-        <w:br w:type="page"/>
-      </w:r>
-    </w:p>
-    <w:p/>
-    <w:p>
-      <w:pPr>
-        <w:jc w:val="center"/>
-        <w:rPr>
-          <w:b/>
-          <w:sz w:val="28"/>
-          <w:szCs w:val="28"/>
-        </w:rPr>
-      </w:pPr>
-      <w:r>
-        <w:rPr>
-          <w:b/>
-          <w:sz w:val="28"/>
-          <w:szCs w:val="28"/>
-        </w:rPr>
-        <w:t>Part 4</w:t>
-      </w:r>
-    </w:p>
-    <w:p>
-      <w:pPr>
-        <w:rPr>
-          <w:lang w:val="en-US"/>
-        </w:rPr>
-      </w:pPr>
-    </w:p>
-    <w:p>
-      <w:pPr>
-        <w:jc w:val="center"/>
-        <w:rPr>
-          <w:sz w:val="28"/>
-          <w:szCs w:val="28"/>
-        </w:rPr>
-      </w:pPr>
-      <w:r>
-        <w:rPr>
-          <w:sz w:val="28"/>
-          <w:szCs w:val="28"/>
-        </w:rPr>
-        <w:t>FLOW CHART</w:t>
-      </w:r>
-    </w:p>
-    <w:p>
-      <w:pPr>
-        <w:jc w:val="center"/>
-        <w:rPr>
-          <w:sz w:val="28"/>
-          <w:szCs w:val="28"/>
-        </w:rPr>
+        <w:t>Figure C-</w:t>
+      </w:r>
+      <w:r>
+        <w:t>5</w:t>
+      </w:r>
+      <w:r>
+        <w:t xml:space="preserve">: </w:t>
+      </w:r>
+      <w:r>
+        <w:t xml:space="preserve">Screenshot of the </w:t>
+      </w:r>
+      <w:r>
+        <w:t>PizzaDAO GetOrderPrice</w:t>
+      </w:r>
+      <w:r>
+        <w:t xml:space="preserve"> and Checkout methods.</w:t>
+      </w:r>
+    </w:p>
+    <w:p>
+      <w:pPr>
+        <w:jc w:val="center"/>
       </w:pPr>
     </w:p>
     <w:p>
@@ -2764,21 +2721,28 @@
           <w:noProof/>
         </w:rPr>
         <w:drawing>
-          <wp:inline distT="114300" distB="114300" distL="114300" distR="114300" wp14:anchorId="2A48C347" wp14:editId="447843FF">
-            <wp:extent cx="3148013" cy="1796373"/>
-            <wp:effectExtent l="0" t="0" r="0" b="0"/>
-            <wp:docPr id="760675676" name="image1.jpg"/>
-            <wp:cNvGraphicFramePr/>
+          <wp:inline distT="114300" distB="114300" distL="114300" distR="114300" wp14:anchorId="6CAA2031" wp14:editId="0ED150B4">
+            <wp:extent cx="5938354" cy="1417320"/>
+            <wp:effectExtent l="0" t="0" r="5715" b="0"/>
+            <wp:docPr id="503816231" name="image1.jpg"/>
+            <wp:cNvGraphicFramePr>
+              <a:graphicFrameLocks xmlns:a="http://schemas.openxmlformats.org/drawingml/2006/main" noChangeAspect="1"/>
+            </wp:cNvGraphicFramePr>
             <a:graphic xmlns:a="http://schemas.openxmlformats.org/drawingml/2006/main">
               <a:graphicData uri="http://schemas.openxmlformats.org/drawingml/2006/picture">
                 <pic:pic xmlns:pic="http://schemas.openxmlformats.org/drawingml/2006/picture">
                   <pic:nvPicPr>
-                    <pic:cNvPr id="0" name="image1.jpg"/>
-                    <pic:cNvPicPr preferRelativeResize="0"/>
+                    <pic:cNvPr id="503816231" name="image1.jpg"/>
+                    <pic:cNvPicPr/>
                   </pic:nvPicPr>
                   <pic:blipFill>
-                    <a:blip r:embed="rId6"/>
-                    <a:srcRect/>
+                    <a:blip r:embed="rId32" cstate="print">
+                      <a:extLst>
+                        <a:ext uri="{28A0092B-C50C-407E-A947-70E740481C1C}">
+                          <a14:useLocalDpi xmlns:a14="http://schemas.microsoft.com/office/drawing/2010/main" val="0"/>
+                        </a:ext>
+                      </a:extLst>
+                    </a:blip>
                     <a:stretch>
                       <a:fillRect/>
                     </a:stretch>
@@ -2786,7 +2750,7 @@
                   <pic:spPr>
                     <a:xfrm>
                       <a:off x="0" y="0"/>
-                      <a:ext cx="3148013" cy="1796373"/>
+                      <a:ext cx="5938354" cy="1417320"/>
                     </a:xfrm>
                     <a:prstGeom prst="rect">
                       <a:avLst/>
@@ -2805,51 +2769,30 @@
         <w:jc w:val="center"/>
       </w:pPr>
       <w:r>
-        <w:t>Figure X: Flow chart of XXXXXXX</w:t>
-      </w:r>
-    </w:p>
-    <w:p>
-      <w:pPr>
-        <w:jc w:val="center"/>
-      </w:pPr>
-    </w:p>
-    <w:p>
-      <w:r>
-        <w:rPr>
-          <w:lang w:val="en-US"/>
-        </w:rPr>
-        <w:t>"Lorem ipsum dolor sit amet, consectetur adipiscing elit, sed do eiusmod tempor incididunt ut labore et dolore magna aliqua. Ut enim ad minim veniam, quis nostrud exercitation ullamco laboris nisi ut aliquip ex ea commodo consequat. Duis aute irure dolor in reprehenderit in voluptate velit esse cillum dolore eu fugiat nulla pariatur. Excepteur sint occaecat cupidatat non proident, sunt in culpa qui officia deserunt mollit anim id est laborum."</w:t>
-      </w:r>
-    </w:p>
-    <w:p>
-      <w:r>
-        <w:br w:type="page"/>
-      </w:r>
-    </w:p>
-    <w:p/>
-    <w:p>
-      <w:pPr>
-        <w:jc w:val="center"/>
-        <w:rPr>
-          <w:sz w:val="28"/>
-          <w:szCs w:val="28"/>
-        </w:rPr>
-      </w:pPr>
-      <w:r>
-        <w:rPr>
-          <w:sz w:val="28"/>
-          <w:szCs w:val="28"/>
-        </w:rPr>
-        <w:t>UML Class Diagram</w:t>
-      </w:r>
-    </w:p>
-    <w:p>
-      <w:pPr>
-        <w:jc w:val="center"/>
-        <w:rPr>
-          <w:sz w:val="28"/>
-          <w:szCs w:val="28"/>
-        </w:rPr>
+        <w:t>Figure C-</w:t>
+      </w:r>
+      <w:r>
+        <w:t>6</w:t>
+      </w:r>
+      <w:r>
+        <w:t xml:space="preserve">: Screenshot of </w:t>
+      </w:r>
+      <w:r>
+        <w:t xml:space="preserve">the </w:t>
+      </w:r>
+      <w:r>
+        <w:t>Pizza</w:t>
+      </w:r>
+      <w:r>
+        <w:t>Logic GetOrderPrice and Checkout methods</w:t>
+      </w:r>
+      <w:r>
+        <w:t>.</w:t>
+      </w:r>
+    </w:p>
+    <w:p>
+      <w:pPr>
+        <w:jc w:val="center"/>
       </w:pPr>
     </w:p>
     <w:p>
@@ -2861,21 +2804,28 @@
           <w:noProof/>
         </w:rPr>
         <w:drawing>
-          <wp:inline distT="114300" distB="114300" distL="114300" distR="114300" wp14:anchorId="54D5793C" wp14:editId="1C98C658">
-            <wp:extent cx="3148013" cy="1796373"/>
-            <wp:effectExtent l="0" t="0" r="0" b="0"/>
-            <wp:docPr id="1436352972" name="image1.jpg"/>
-            <wp:cNvGraphicFramePr/>
+          <wp:inline distT="114300" distB="114300" distL="114300" distR="114300" wp14:anchorId="0FFE39FE" wp14:editId="0F11CCC1">
+            <wp:extent cx="5952591" cy="1655064"/>
+            <wp:effectExtent l="0" t="0" r="0" b="2540"/>
+            <wp:docPr id="1682083272" name="image1.jpg"/>
+            <wp:cNvGraphicFramePr>
+              <a:graphicFrameLocks xmlns:a="http://schemas.openxmlformats.org/drawingml/2006/main" noChangeAspect="1"/>
+            </wp:cNvGraphicFramePr>
             <a:graphic xmlns:a="http://schemas.openxmlformats.org/drawingml/2006/main">
               <a:graphicData uri="http://schemas.openxmlformats.org/drawingml/2006/picture">
                 <pic:pic xmlns:pic="http://schemas.openxmlformats.org/drawingml/2006/picture">
                   <pic:nvPicPr>
-                    <pic:cNvPr id="0" name="image1.jpg"/>
-                    <pic:cNvPicPr preferRelativeResize="0"/>
+                    <pic:cNvPr id="1682083272" name="image1.jpg"/>
+                    <pic:cNvPicPr/>
                   </pic:nvPicPr>
                   <pic:blipFill>
-                    <a:blip r:embed="rId6"/>
-                    <a:srcRect/>
+                    <a:blip r:embed="rId33" cstate="print">
+                      <a:extLst>
+                        <a:ext uri="{28A0092B-C50C-407E-A947-70E740481C1C}">
+                          <a14:useLocalDpi xmlns:a14="http://schemas.microsoft.com/office/drawing/2010/main" val="0"/>
+                        </a:ext>
+                      </a:extLst>
+                    </a:blip>
                     <a:stretch>
                       <a:fillRect/>
                     </a:stretch>
@@ -2883,7 +2833,7 @@
                   <pic:spPr>
                     <a:xfrm>
                       <a:off x="0" y="0"/>
-                      <a:ext cx="3148013" cy="1796373"/>
+                      <a:ext cx="5952591" cy="1655064"/>
                     </a:xfrm>
                     <a:prstGeom prst="rect">
                       <a:avLst/>
@@ -2902,66 +2852,33 @@
         <w:jc w:val="center"/>
       </w:pPr>
       <w:r>
-        <w:t>Figure X: UML Class Diagram</w:t>
-      </w:r>
-    </w:p>
-    <w:p>
-      <w:pPr>
-        <w:jc w:val="center"/>
-      </w:pPr>
-    </w:p>
-    <w:p>
-      <w:r>
-        <w:rPr>
-          <w:lang w:val="en-US"/>
-        </w:rPr>
-        <w:t xml:space="preserve">Lorem ipsum dolor sit amet, consectetur adipiscing elit, sed do eiusmod tempor incididunt ut labore et dolore magna aliqua. </w:t>
-      </w:r>
-      <w:r>
-        <w:rPr>
-          <w:lang w:val="pt-BR"/>
-        </w:rPr>
-        <w:t xml:space="preserve">Ut enim ad minim veniam, quis nostrud exercitation ullamco laboris nisi ut aliquip ex ea commodo consequat. </w:t>
-      </w:r>
-      <w:r>
-        <w:rPr>
-          <w:lang w:val="en-US"/>
-        </w:rPr>
-        <w:t>Duis aute irure dolor in reprehenderit in voluptate velit esse cillum dolore eu fugiat nulla pariatur. Excepteur sint occaecat cupidatat non proident, sunt in culpa qui officia deserunt mollit anim id est laborum.</w:t>
-      </w:r>
-    </w:p>
-    <w:p>
-      <w:pPr>
-        <w:jc w:val="center"/>
-      </w:pPr>
-      <w:r>
-        <w:br w:type="page"/>
-      </w:r>
-    </w:p>
-    <w:p>
-      <w:pPr>
-        <w:jc w:val="center"/>
-        <w:rPr>
-          <w:sz w:val="28"/>
-          <w:szCs w:val="28"/>
-        </w:rPr>
-      </w:pPr>
-      <w:r>
-        <w:rPr>
-          <w:sz w:val="28"/>
-          <w:szCs w:val="28"/>
-        </w:rPr>
-        <w:lastRenderedPageBreak/>
-        <w:t>Screen Shots</w:t>
-      </w:r>
-    </w:p>
-    <w:p>
-      <w:pPr>
-        <w:jc w:val="center"/>
-        <w:rPr>
-          <w:sz w:val="28"/>
-          <w:szCs w:val="28"/>
-        </w:rPr>
+        <w:t>Figure C-</w:t>
+      </w:r>
+      <w:r>
+        <w:t>7</w:t>
+      </w:r>
+      <w:r>
+        <w:t xml:space="preserve">: Screenshot of </w:t>
+      </w:r>
+      <w:r>
+        <w:t xml:space="preserve">the </w:t>
+      </w:r>
+      <w:r>
+        <w:t>Pizza Maker Form</w:t>
+      </w:r>
+      <w:r>
+        <w:t>’s</w:t>
+      </w:r>
+      <w:r>
+        <w:t xml:space="preserve"> checkout button event handler</w:t>
+      </w:r>
+      <w:r>
+        <w:t>.</w:t>
+      </w:r>
+    </w:p>
+    <w:p>
+      <w:pPr>
+        <w:jc w:val="center"/>
       </w:pPr>
     </w:p>
     <w:p>
@@ -2973,21 +2890,28 @@
           <w:noProof/>
         </w:rPr>
         <w:drawing>
-          <wp:inline distT="114300" distB="114300" distL="114300" distR="114300" wp14:anchorId="2BFDE5C0" wp14:editId="4663D10A">
-            <wp:extent cx="3148013" cy="1796373"/>
-            <wp:effectExtent l="0" t="0" r="0" b="0"/>
-            <wp:docPr id="1597765753" name="image1.jpg"/>
-            <wp:cNvGraphicFramePr/>
+          <wp:inline distT="114300" distB="114300" distL="114300" distR="114300" wp14:anchorId="36816A84" wp14:editId="55236E00">
+            <wp:extent cx="5943600" cy="1536192"/>
+            <wp:effectExtent l="0" t="0" r="0" b="6985"/>
+            <wp:docPr id="28510545" name="image1.jpg"/>
+            <wp:cNvGraphicFramePr>
+              <a:graphicFrameLocks xmlns:a="http://schemas.openxmlformats.org/drawingml/2006/main" noChangeAspect="1"/>
+            </wp:cNvGraphicFramePr>
             <a:graphic xmlns:a="http://schemas.openxmlformats.org/drawingml/2006/main">
               <a:graphicData uri="http://schemas.openxmlformats.org/drawingml/2006/picture">
                 <pic:pic xmlns:pic="http://schemas.openxmlformats.org/drawingml/2006/picture">
                   <pic:nvPicPr>
-                    <pic:cNvPr id="0" name="image1.jpg"/>
-                    <pic:cNvPicPr preferRelativeResize="0"/>
+                    <pic:cNvPr id="28510545" name="image1.jpg"/>
+                    <pic:cNvPicPr/>
                   </pic:nvPicPr>
                   <pic:blipFill>
-                    <a:blip r:embed="rId6"/>
-                    <a:srcRect/>
+                    <a:blip r:embed="rId34">
+                      <a:extLst>
+                        <a:ext uri="{28A0092B-C50C-407E-A947-70E740481C1C}">
+                          <a14:useLocalDpi xmlns:a14="http://schemas.microsoft.com/office/drawing/2010/main" val="0"/>
+                        </a:ext>
+                      </a:extLst>
+                    </a:blip>
                     <a:stretch>
                       <a:fillRect/>
                     </a:stretch>
@@ -2995,7 +2919,7 @@
                   <pic:spPr>
                     <a:xfrm>
                       <a:off x="0" y="0"/>
-                      <a:ext cx="3148013" cy="1796373"/>
+                      <a:ext cx="5943600" cy="1536192"/>
                     </a:xfrm>
                     <a:prstGeom prst="rect">
                       <a:avLst/>
@@ -3014,49 +2938,86 @@
         <w:jc w:val="center"/>
       </w:pPr>
       <w:r>
-        <w:t>Figure X: Part 4 App Running</w:t>
-      </w:r>
-    </w:p>
-    <w:p>
-      <w:pPr>
-        <w:jc w:val="center"/>
-      </w:pPr>
-    </w:p>
-    <w:p>
-      <w:pPr>
-        <w:rPr>
+        <w:t>Figure C-</w:t>
+      </w:r>
+      <w:r>
+        <w:t>8</w:t>
+      </w:r>
+      <w:r>
+        <w:t xml:space="preserve">: Screenshot of </w:t>
+      </w:r>
+      <w:r>
+        <w:t xml:space="preserve">the </w:t>
+      </w:r>
+      <w:r>
+        <w:t>Order Detail</w:t>
+      </w:r>
+      <w:r>
+        <w:t>s’ cancel button event handler</w:t>
+      </w:r>
+      <w:r>
+        <w:t>.</w:t>
+      </w:r>
+    </w:p>
+    <w:p>
+      <w:pPr>
+        <w:jc w:val="center"/>
+        <w:rPr>
+          <w:b/>
+          <w:sz w:val="28"/>
+          <w:szCs w:val="28"/>
+        </w:rPr>
+      </w:pPr>
+      <w:r>
+        <w:rPr>
+          <w:b/>
+          <w:sz w:val="28"/>
+          <w:szCs w:val="28"/>
+        </w:rPr>
+        <w:lastRenderedPageBreak/>
+        <w:t xml:space="preserve">Part </w:t>
+      </w:r>
+      <w:r>
+        <w:rPr>
+          <w:b/>
+          <w:sz w:val="28"/>
+          <w:szCs w:val="28"/>
+        </w:rPr>
+        <w:t>3</w:t>
+      </w:r>
+      <w:r>
+        <w:rPr>
+          <w:b/>
+          <w:sz w:val="28"/>
+          <w:szCs w:val="28"/>
+        </w:rPr>
+        <w:t xml:space="preserve"> Topic 5 Planning</w:t>
+      </w:r>
+    </w:p>
+    <w:p>
+      <w:pPr>
+        <w:rPr>
+          <w:sz w:val="16"/>
+          <w:szCs w:val="16"/>
           <w:lang w:val="en-US"/>
         </w:rPr>
       </w:pPr>
-      <w:r>
-        <w:rPr>
-          <w:lang w:val="en-US"/>
-        </w:rPr>
-        <w:t xml:space="preserve">Lorem ipsum dolor sit amet, consectetur adipiscing elit, sed do eiusmod tempor incididunt ut labore et dolore magna aliqua. </w:t>
-      </w:r>
-      <w:r>
-        <w:rPr>
-          <w:lang w:val="pt-BR"/>
-        </w:rPr>
-        <w:t xml:space="preserve">Ut enim ad minim veniam, quis nostrud exercitation ullamco laboris nisi ut aliquip ex ea commodo consequat. </w:t>
-      </w:r>
-      <w:r>
-        <w:rPr>
-          <w:lang w:val="en-US"/>
-        </w:rPr>
-        <w:t>Duis aute irure dolor in reprehenderit in voluptate velit esse cillum dolore eu fugiat nulla pariatur. Excepteur sint occaecat cupidatat non proident, sunt in culpa qui officia deserunt mollit anim id est laborum.</w:t>
-      </w:r>
-    </w:p>
-    <w:p/>
-    <w:p/>
-    <w:p>
-      <w:pPr>
-        <w:jc w:val="center"/>
-        <w:rPr>
-          <w:sz w:val="28"/>
-          <w:szCs w:val="28"/>
-        </w:rPr>
-      </w:pPr>
+    </w:p>
+    <w:p>
+      <w:pPr>
+        <w:jc w:val="center"/>
+        <w:rPr>
+          <w:sz w:val="28"/>
+          <w:szCs w:val="28"/>
+        </w:rPr>
+      </w:pPr>
+      <w:r>
+        <w:rPr>
+          <w:sz w:val="28"/>
+          <w:szCs w:val="28"/>
+        </w:rPr>
+        <w:t>FLOW CHART</w:t>
+      </w:r>
     </w:p>
     <w:p>
       <w:pPr>
@@ -3067,21 +3028,28 @@
           <w:noProof/>
         </w:rPr>
         <w:drawing>
-          <wp:inline distT="114300" distB="114300" distL="114300" distR="114300" wp14:anchorId="7E5741BF" wp14:editId="748249C6">
-            <wp:extent cx="3148013" cy="1796373"/>
+          <wp:inline distT="114300" distB="114300" distL="114300" distR="114300" wp14:anchorId="2A48C347" wp14:editId="4C779196">
+            <wp:extent cx="5943600" cy="6940296"/>
             <wp:effectExtent l="0" t="0" r="0" b="0"/>
-            <wp:docPr id="458816738" name="image1.jpg"/>
-            <wp:cNvGraphicFramePr/>
+            <wp:docPr id="760675676" name="image1.jpg"/>
+            <wp:cNvGraphicFramePr>
+              <a:graphicFrameLocks xmlns:a="http://schemas.openxmlformats.org/drawingml/2006/main" noChangeAspect="1"/>
+            </wp:cNvGraphicFramePr>
             <a:graphic xmlns:a="http://schemas.openxmlformats.org/drawingml/2006/main">
               <a:graphicData uri="http://schemas.openxmlformats.org/drawingml/2006/picture">
                 <pic:pic xmlns:pic="http://schemas.openxmlformats.org/drawingml/2006/picture">
                   <pic:nvPicPr>
-                    <pic:cNvPr id="0" name="image1.jpg"/>
-                    <pic:cNvPicPr preferRelativeResize="0"/>
+                    <pic:cNvPr id="760675676" name="image1.jpg"/>
+                    <pic:cNvPicPr/>
                   </pic:nvPicPr>
                   <pic:blipFill>
-                    <a:blip r:embed="rId6"/>
-                    <a:srcRect/>
+                    <a:blip r:embed="rId35">
+                      <a:extLst>
+                        <a:ext uri="{28A0092B-C50C-407E-A947-70E740481C1C}">
+                          <a14:useLocalDpi xmlns:a14="http://schemas.microsoft.com/office/drawing/2010/main" val="0"/>
+                        </a:ext>
+                      </a:extLst>
+                    </a:blip>
                     <a:stretch>
                       <a:fillRect/>
                     </a:stretch>
@@ -3089,7 +3057,7 @@
                   <pic:spPr>
                     <a:xfrm>
                       <a:off x="0" y="0"/>
-                      <a:ext cx="3148013" cy="1796373"/>
+                      <a:ext cx="5943600" cy="6940296"/>
                     </a:xfrm>
                     <a:prstGeom prst="rect">
                       <a:avLst/>
@@ -3108,24 +3076,62 @@
         <w:jc w:val="center"/>
       </w:pPr>
       <w:r>
-        <w:t>Figure X: Screenshot of successful output</w:t>
-      </w:r>
-    </w:p>
-    <w:p>
-      <w:pPr>
-        <w:jc w:val="center"/>
-      </w:pPr>
-    </w:p>
-    <w:p>
-      <w:r>
-        <w:rPr>
-          <w:lang w:val="en-US"/>
-        </w:rPr>
-        <w:t>Lorem ipsum dolor sit amet, consectetur adipiscing elit, sed do eiusmod tempor incididunt ut labore et dolore magna aliqua. Ut enim ad minim veniam, quis nostrud exercitation ullamco laboris nisi ut aliquip ex ea commodo consequat. Duis aute irure dolor in reprehenderit in voluptate velit esse cillum dolore eu fugiat nulla pariatur. Excepteur sint occaecat cupidatat non proident, sunt in culpa qui officia deserunt mollit anim id est laborum.</w:t>
+        <w:t xml:space="preserve">Figure </w:t>
+      </w:r>
+      <w:r>
+        <w:t>4-1</w:t>
+      </w:r>
+      <w:r>
+        <w:t xml:space="preserve">: </w:t>
+      </w:r>
+      <w:r>
+        <w:t>Preliminary f</w:t>
+      </w:r>
+      <w:r>
+        <w:t xml:space="preserve">low chart of </w:t>
+      </w:r>
+      <w:r>
+        <w:t xml:space="preserve">week five </w:t>
+      </w:r>
+      <w:r>
+        <w:t>whack</w:t>
+      </w:r>
+      <w:r>
+        <w:t>-a-mole game</w:t>
+      </w:r>
+      <w:r>
+        <w:t>.</w:t>
+      </w:r>
+      <w:r>
+        <w:br w:type="page"/>
       </w:r>
     </w:p>
     <w:p/>
-    <w:p/>
+    <w:p>
+      <w:pPr>
+        <w:jc w:val="center"/>
+        <w:rPr>
+          <w:sz w:val="28"/>
+          <w:szCs w:val="28"/>
+        </w:rPr>
+      </w:pPr>
+      <w:r>
+        <w:rPr>
+          <w:sz w:val="28"/>
+          <w:szCs w:val="28"/>
+        </w:rPr>
+        <w:t>UML Class Diagram</w:t>
+      </w:r>
+    </w:p>
+    <w:p>
+      <w:pPr>
+        <w:jc w:val="center"/>
+        <w:rPr>
+          <w:sz w:val="28"/>
+          <w:szCs w:val="28"/>
+        </w:rPr>
+      </w:pPr>
+    </w:p>
     <w:p>
       <w:pPr>
         <w:jc w:val="center"/>
@@ -3134,23 +3140,29 @@
         <w:rPr>
           <w:noProof/>
         </w:rPr>
-        <w:lastRenderedPageBreak/>
         <w:drawing>
-          <wp:inline distT="114300" distB="114300" distL="114300" distR="114300" wp14:anchorId="455527D7" wp14:editId="6EE64722">
-            <wp:extent cx="3148013" cy="1796373"/>
-            <wp:effectExtent l="0" t="0" r="0" b="0"/>
-            <wp:docPr id="727658154" name="image1.jpg"/>
-            <wp:cNvGraphicFramePr/>
+          <wp:inline distT="114300" distB="114300" distL="114300" distR="114300" wp14:anchorId="54D5793C" wp14:editId="3B0E924F">
+            <wp:extent cx="5943600" cy="5650992"/>
+            <wp:effectExtent l="0" t="0" r="0" b="6985"/>
+            <wp:docPr id="1436352972" name="image1.jpg"/>
+            <wp:cNvGraphicFramePr>
+              <a:graphicFrameLocks xmlns:a="http://schemas.openxmlformats.org/drawingml/2006/main" noChangeAspect="1"/>
+            </wp:cNvGraphicFramePr>
             <a:graphic xmlns:a="http://schemas.openxmlformats.org/drawingml/2006/main">
               <a:graphicData uri="http://schemas.openxmlformats.org/drawingml/2006/picture">
                 <pic:pic xmlns:pic="http://schemas.openxmlformats.org/drawingml/2006/picture">
                   <pic:nvPicPr>
-                    <pic:cNvPr id="0" name="image1.jpg"/>
-                    <pic:cNvPicPr preferRelativeResize="0"/>
+                    <pic:cNvPr id="1436352972" name="image1.jpg"/>
+                    <pic:cNvPicPr/>
                   </pic:nvPicPr>
                   <pic:blipFill>
-                    <a:blip r:embed="rId6"/>
-                    <a:srcRect/>
+                    <a:blip r:embed="rId36">
+                      <a:extLst>
+                        <a:ext uri="{28A0092B-C50C-407E-A947-70E740481C1C}">
+                          <a14:useLocalDpi xmlns:a14="http://schemas.microsoft.com/office/drawing/2010/main" val="0"/>
+                        </a:ext>
+                      </a:extLst>
+                    </a:blip>
                     <a:stretch>
                       <a:fillRect/>
                     </a:stretch>
@@ -3158,7 +3170,7 @@
                   <pic:spPr>
                     <a:xfrm>
                       <a:off x="0" y="0"/>
-                      <a:ext cx="3148013" cy="1796373"/>
+                      <a:ext cx="5943600" cy="5650992"/>
                     </a:xfrm>
                     <a:prstGeom prst="rect">
                       <a:avLst/>
@@ -3177,25 +3189,34 @@
         <w:jc w:val="center"/>
       </w:pPr>
       <w:r>
-        <w:t>Figure X: Screenshot of Error Handling</w:t>
-      </w:r>
-    </w:p>
-    <w:p>
-      <w:pPr>
-        <w:jc w:val="center"/>
-      </w:pPr>
-    </w:p>
-    <w:p>
-      <w:r>
-        <w:rPr>
-          <w:lang w:val="en-US"/>
-        </w:rPr>
-        <w:t>Lorem ipsum dolor sit amet, consectetur adipiscing elit, sed do eiusmod tempor incididunt ut labore et dolore magna aliqua. Ut enim ad minim veniam, quis nostrud exercitation ullamco laboris nisi ut aliquip ex ea commodo consequat. Duis aute irure dolor in reprehenderit in voluptate velit esse cillum dolore eu fugiat nulla pariatur. Excepteur sint occaecat cupidatat non proident, sunt in culpa qui officia deserunt mollit anim id est laborum.</w:t>
-      </w:r>
-    </w:p>
-    <w:p/>
-    <w:p/>
-    <w:p/>
+        <w:t xml:space="preserve">Figure </w:t>
+      </w:r>
+      <w:r>
+        <w:t>4-2</w:t>
+      </w:r>
+      <w:r>
+        <w:t xml:space="preserve">: </w:t>
+      </w:r>
+      <w:r>
+        <w:t xml:space="preserve">Preliminary </w:t>
+      </w:r>
+      <w:r>
+        <w:t>UML Class Diagram</w:t>
+      </w:r>
+      <w:r>
+        <w:t xml:space="preserve"> for the week 5 whack-a-mole project</w:t>
+      </w:r>
+    </w:p>
+    <w:p>
+      <w:pPr>
+        <w:jc w:val="center"/>
+      </w:pPr>
+    </w:p>
+    <w:p>
+      <w:pPr>
+        <w:jc w:val="center"/>
+      </w:pPr>
+    </w:p>
     <w:sectPr>
       <w:pgSz w:w="12240" w:h="15840"/>
       <w:pgMar w:top="1440" w:right="1440" w:bottom="1440" w:left="1440" w:header="720" w:footer="720" w:gutter="0"/>
@@ -3844,6 +3865,7 @@
   <w:style w:type="character" w:default="1" w:styleId="DefaultParagraphFont">
     <w:name w:val="Default Paragraph Font"/>
     <w:uiPriority w:val="1"/>
+    <w:semiHidden/>
     <w:unhideWhenUsed/>
   </w:style>
   <w:style w:type="table" w:default="1" w:styleId="TableNormal">

</xml_diff>